<commit_message>
Mise à jour du cahier de charges
Règles de gestion RG1 à RG22 et ajout du tableau « Qui peut faire quoi » et des fonctionnalités de la maquette.
</commit_message>
<xml_diff>
--- a/cadrage/cahier_de_charges.docx
+++ b/cadrage/cahier_de_charges.docx
@@ -527,7 +527,7 @@
                 <w:sz w:val="20"/>
                 <w:szCs w:val="20"/>
               </w:rPr>
-              <w:t xml:space="preserve">19 octobre 2026</w:t>
+              <w:t xml:space="preserve">19 octobre 2026 (mis à jour le 30 octobre 2026)</w:t>
             </w:r>
           </w:p>
         </w:tc>
@@ -1431,6 +1431,459 @@
         <w:pStyle w:val="Heading1"/>
         <w:keepNext/>
         <w:pBdr>
+          <w:bottom w:val="single" w:color="047857" w:sz="12" w:space="4"/>
+        </w:pBdr>
+        <w:spacing w:after="160" w:before="360"/>
+      </w:pPr>
+      <w:r>
+        <w:rPr>
+          <w:rFonts w:ascii="Calibri" w:cs="Calibri" w:eastAsia="Calibri" w:hAnsi="Calibri"/>
+          <w:b/>
+          <w:bCs/>
+          <w:color w:val="FFFFFF"/>
+          <w:sz w:val="30"/>
+          <w:szCs w:val="30"/>
+          <w:shd w:fill="047857" w:color="auto" w:val="clear"/>
+        </w:rPr>
+        <w:t xml:space="preserve"> 3 </w:t>
+      </w:r>
+      <w:r>
+        <w:rPr>
+          <w:rFonts w:ascii="Calibri" w:cs="Calibri" w:eastAsia="Calibri" w:hAnsi="Calibri"/>
+          <w:b/>
+          <w:bCs/>
+          <w:color w:val="1E293B"/>
+          <w:sz w:val="32"/>
+          <w:szCs w:val="32"/>
+        </w:rPr>
+        <w:t xml:space="preserve">   Solution proposée</w:t>
+      </w:r>
+    </w:p>
+    <w:p>
+      <w:pPr>
+        <w:keepNext/>
+        <w:spacing w:after="100" w:line="280"/>
+      </w:pPr>
+      <w:r>
+        <w:rPr>
+          <w:rFonts w:ascii="Calibri" w:cs="Calibri" w:eastAsia="Calibri" w:hAnsi="Calibri"/>
+          <w:color w:val="1E293B"/>
+          <w:sz w:val="21"/>
+          <w:szCs w:val="21"/>
+        </w:rPr>
+        <w:t xml:space="preserve">La solution proposée est une application web de gestion, accessible depuis un navigateur sur ordinateur et sur téléphone. Elle remplace le cahier, WhatsApp et Excel par un seul outil partagé par les 4 personnes de l'agence, avec des accès différents selon le rôle. Elle est offerte gratuitement à l'agence.</w:t>
+      </w:r>
+    </w:p>
+    <w:tbl>
+      <w:tblPr>
+        <w:tblW w:type="dxa" w:w="9638"/>
+        <w:tblBorders>
+          <w:top w:val="none" w:color="FFFFFF" w:sz="0"/>
+          <w:left w:val="none" w:color="FFFFFF" w:sz="0"/>
+          <w:bottom w:val="none" w:color="FFFFFF" w:sz="0"/>
+          <w:right w:val="none" w:color="FFFFFF" w:sz="0"/>
+          <w:insideH w:val="none" w:color="FFFFFF" w:sz="0"/>
+          <w:insideV w:val="none" w:color="FFFFFF" w:sz="0"/>
+        </w:tblBorders>
+        <w:tblLayout w:type="fixed"/>
+      </w:tblPr>
+      <w:tblGrid>
+        <w:gridCol w:w="2410"/>
+        <w:gridCol w:w="2410"/>
+        <w:gridCol w:w="2409"/>
+        <w:gridCol w:w="2409"/>
+      </w:tblGrid>
+      <w:tr>
+        <w:trPr>
+          <w:cantSplit/>
+        </w:trPr>
+        <w:tc>
+          <w:tcPr>
+            <w:tcW w:type="dxa" w:w="2410"/>
+            <w:tcBorders>
+              <w:top w:val="none" w:color="FFFFFF" w:sz="0"/>
+              <w:left w:val="none" w:color="FFFFFF" w:sz="0"/>
+              <w:bottom w:val="none" w:color="FFFFFF" w:sz="0"/>
+              <w:right w:val="single" w:color="FFFFFF" w:sz="24"/>
+            </w:tcBorders>
+            <w:shd w:fill="F5A01A" w:color="auto" w:val="clear"/>
+            <w:tcMar>
+              <w:top w:type="dxa" w:w="150"/>
+              <w:left w:type="dxa" w:w="160"/>
+              <w:bottom w:type="dxa" w:w="170"/>
+              <w:right w:type="dxa" w:w="160"/>
+            </w:tcMar>
+            <w:vAlign w:val="top"/>
+          </w:tcPr>
+          <w:p>
+            <w:pPr>
+              <w:keepNext/>
+              <w:spacing w:after="40"/>
+            </w:pPr>
+            <w:r>
+              <w:rPr>
+                <w:rFonts w:ascii="Calibri" w:cs="Calibri" w:eastAsia="Calibri" w:hAnsi="Calibri"/>
+                <w:b/>
+                <w:bCs/>
+                <w:color w:val="FFFFFF"/>
+                <w:sz w:val="17"/>
+                <w:szCs w:val="17"/>
+              </w:rPr>
+              <w:t xml:space="preserve">MODULE 1</w:t>
+            </w:r>
+          </w:p>
+          <w:p>
+            <w:pPr>
+              <w:keepNext/>
+              <w:spacing w:after="80"/>
+            </w:pPr>
+            <w:r>
+              <w:rPr>
+                <w:rFonts w:ascii="Calibri" w:cs="Calibri" w:eastAsia="Calibri" w:hAnsi="Calibri"/>
+                <w:b/>
+                <w:bCs/>
+                <w:color w:val="FFFFFF"/>
+                <w:sz w:val="22"/>
+                <w:szCs w:val="22"/>
+              </w:rPr>
+              <w:t xml:space="preserve">Clients et dossiers</w:t>
+            </w:r>
+          </w:p>
+          <w:p>
+            <w:pPr>
+              <w:spacing w:after="0" w:line="255"/>
+            </w:pPr>
+            <w:r>
+              <w:rPr>
+                <w:rFonts w:ascii="Calibri" w:cs="Calibri" w:eastAsia="Calibri" w:hAnsi="Calibri"/>
+                <w:color w:val="FFFFFF"/>
+                <w:sz w:val="18"/>
+                <w:szCs w:val="18"/>
+              </w:rPr>
+              <w:t xml:space="preserve">Toutes les fiches clients et tous les dossiers au même endroit, avec une recherche rapide.</w:t>
+            </w:r>
+          </w:p>
+        </w:tc>
+        <w:tc>
+          <w:tcPr>
+            <w:tcW w:type="dxa" w:w="2410"/>
+            <w:tcBorders>
+              <w:top w:val="none" w:color="FFFFFF" w:sz="0"/>
+              <w:left w:val="none" w:color="FFFFFF" w:sz="0"/>
+              <w:bottom w:val="none" w:color="FFFFFF" w:sz="0"/>
+              <w:right w:val="single" w:color="FFFFFF" w:sz="24"/>
+            </w:tcBorders>
+            <w:shd w:fill="0F766E" w:color="auto" w:val="clear"/>
+            <w:tcMar>
+              <w:top w:type="dxa" w:w="150"/>
+              <w:left w:type="dxa" w:w="160"/>
+              <w:bottom w:type="dxa" w:w="170"/>
+              <w:right w:type="dxa" w:w="160"/>
+            </w:tcMar>
+            <w:vAlign w:val="top"/>
+          </w:tcPr>
+          <w:p>
+            <w:pPr>
+              <w:keepNext/>
+              <w:spacing w:after="40"/>
+            </w:pPr>
+            <w:r>
+              <w:rPr>
+                <w:rFonts w:ascii="Calibri" w:cs="Calibri" w:eastAsia="Calibri" w:hAnsi="Calibri"/>
+                <w:b/>
+                <w:bCs/>
+                <w:color w:val="FFFFFF"/>
+                <w:sz w:val="17"/>
+                <w:szCs w:val="17"/>
+              </w:rPr>
+              <w:t xml:space="preserve">MODULE 2</w:t>
+            </w:r>
+          </w:p>
+          <w:p>
+            <w:pPr>
+              <w:keepNext/>
+              <w:spacing w:after="80"/>
+            </w:pPr>
+            <w:r>
+              <w:rPr>
+                <w:rFonts w:ascii="Calibri" w:cs="Calibri" w:eastAsia="Calibri" w:hAnsi="Calibri"/>
+                <w:b/>
+                <w:bCs/>
+                <w:color w:val="FFFFFF"/>
+                <w:sz w:val="22"/>
+                <w:szCs w:val="22"/>
+              </w:rPr>
+              <w:t xml:space="preserve">Réservations et paiements</w:t>
+            </w:r>
+          </w:p>
+          <w:p>
+            <w:pPr>
+              <w:spacing w:after="0" w:line="255"/>
+            </w:pPr>
+            <w:r>
+              <w:rPr>
+                <w:rFonts w:ascii="Calibri" w:cs="Calibri" w:eastAsia="Calibri" w:hAnsi="Calibri"/>
+                <w:color w:val="FFFFFF"/>
+                <w:sz w:val="18"/>
+                <w:szCs w:val="18"/>
+              </w:rPr>
+              <w:t xml:space="preserve">Paiements enregistrés, reste à payer calculé automatiquement, reçus et décharge pour visa.</w:t>
+            </w:r>
+          </w:p>
+        </w:tc>
+        <w:tc>
+          <w:tcPr>
+            <w:tcW w:type="dxa" w:w="2409"/>
+            <w:tcBorders>
+              <w:top w:val="none" w:color="FFFFFF" w:sz="0"/>
+              <w:left w:val="none" w:color="FFFFFF" w:sz="0"/>
+              <w:bottom w:val="none" w:color="FFFFFF" w:sz="0"/>
+              <w:right w:val="single" w:color="FFFFFF" w:sz="24"/>
+            </w:tcBorders>
+            <w:shd w:fill="1D4ED8" w:color="auto" w:val="clear"/>
+            <w:tcMar>
+              <w:top w:type="dxa" w:w="150"/>
+              <w:left w:type="dxa" w:w="160"/>
+              <w:bottom w:type="dxa" w:w="170"/>
+              <w:right w:type="dxa" w:w="160"/>
+            </w:tcMar>
+            <w:vAlign w:val="top"/>
+          </w:tcPr>
+          <w:p>
+            <w:pPr>
+              <w:keepNext/>
+              <w:spacing w:after="40"/>
+            </w:pPr>
+            <w:r>
+              <w:rPr>
+                <w:rFonts w:ascii="Calibri" w:cs="Calibri" w:eastAsia="Calibri" w:hAnsi="Calibri"/>
+                <w:b/>
+                <w:bCs/>
+                <w:color w:val="FFFFFF"/>
+                <w:sz w:val="17"/>
+                <w:szCs w:val="17"/>
+              </w:rPr>
+              <w:t xml:space="preserve">MODULE 3</w:t>
+            </w:r>
+          </w:p>
+          <w:p>
+            <w:pPr>
+              <w:keepNext/>
+              <w:spacing w:after="80"/>
+            </w:pPr>
+            <w:r>
+              <w:rPr>
+                <w:rFonts w:ascii="Calibri" w:cs="Calibri" w:eastAsia="Calibri" w:hAnsi="Calibri"/>
+                <w:b/>
+                <w:bCs/>
+                <w:color w:val="FFFFFF"/>
+                <w:sz w:val="22"/>
+                <w:szCs w:val="22"/>
+              </w:rPr>
+              <w:t xml:space="preserve">Pièces et échéances</w:t>
+            </w:r>
+          </w:p>
+          <w:p>
+            <w:pPr>
+              <w:spacing w:after="0" w:line="255"/>
+            </w:pPr>
+            <w:r>
+              <w:rPr>
+                <w:rFonts w:ascii="Calibri" w:cs="Calibri" w:eastAsia="Calibri" w:hAnsi="Calibri"/>
+                <w:color w:val="FFFFFF"/>
+                <w:sz w:val="18"/>
+                <w:szCs w:val="18"/>
+              </w:rPr>
+              <w:t xml:space="preserve">Pièces manquantes et dates limites affichées, avec des alertes de départ et de relance.</w:t>
+            </w:r>
+          </w:p>
+        </w:tc>
+        <w:tc>
+          <w:tcPr>
+            <w:tcW w:type="dxa" w:w="2409"/>
+            <w:tcBorders>
+              <w:top w:val="none" w:color="FFFFFF" w:sz="0"/>
+              <w:left w:val="none" w:color="FFFFFF" w:sz="0"/>
+              <w:bottom w:val="none" w:color="FFFFFF" w:sz="0"/>
+              <w:right w:val="none" w:color="FFFFFF" w:sz="0"/>
+            </w:tcBorders>
+            <w:shd w:fill="7C3AED" w:color="auto" w:val="clear"/>
+            <w:tcMar>
+              <w:top w:type="dxa" w:w="150"/>
+              <w:left w:type="dxa" w:w="160"/>
+              <w:bottom w:type="dxa" w:w="170"/>
+              <w:right w:type="dxa" w:w="160"/>
+            </w:tcMar>
+            <w:vAlign w:val="top"/>
+          </w:tcPr>
+          <w:p>
+            <w:pPr>
+              <w:keepNext/>
+              <w:spacing w:after="40"/>
+            </w:pPr>
+            <w:r>
+              <w:rPr>
+                <w:rFonts w:ascii="Calibri" w:cs="Calibri" w:eastAsia="Calibri" w:hAnsi="Calibri"/>
+                <w:b/>
+                <w:bCs/>
+                <w:color w:val="FFFFFF"/>
+                <w:sz w:val="17"/>
+                <w:szCs w:val="17"/>
+              </w:rPr>
+              <w:t xml:space="preserve">MODULE 4</w:t>
+            </w:r>
+          </w:p>
+          <w:p>
+            <w:pPr>
+              <w:keepNext/>
+              <w:spacing w:after="80"/>
+            </w:pPr>
+            <w:r>
+              <w:rPr>
+                <w:rFonts w:ascii="Calibri" w:cs="Calibri" w:eastAsia="Calibri" w:hAnsi="Calibri"/>
+                <w:b/>
+                <w:bCs/>
+                <w:color w:val="FFFFFF"/>
+                <w:sz w:val="22"/>
+                <w:szCs w:val="22"/>
+              </w:rPr>
+              <w:t xml:space="preserve">Tableau de bord et accès</w:t>
+            </w:r>
+          </w:p>
+          <w:p>
+            <w:pPr>
+              <w:spacing w:after="0" w:line="255"/>
+            </w:pPr>
+            <w:r>
+              <w:rPr>
+                <w:rFonts w:ascii="Calibri" w:cs="Calibri" w:eastAsia="Calibri" w:hAnsi="Calibri"/>
+                <w:color w:val="FFFFFF"/>
+                <w:sz w:val="18"/>
+                <w:szCs w:val="18"/>
+              </w:rPr>
+              <w:t xml:space="preserve">Un écran d'accueil clair et une connexion avec des droits selon le rôle.</w:t>
+            </w:r>
+          </w:p>
+        </w:tc>
+      </w:tr>
+    </w:tbl>
+    <w:p>
+      <w:pPr>
+        <w:keepNext/>
+        <w:spacing w:after="100" w:before="260"/>
+      </w:pPr>
+      <w:r>
+        <w:rPr>
+          <w:rFonts w:ascii="Calibri" w:cs="Calibri" w:eastAsia="Calibri" w:hAnsi="Calibri"/>
+          <w:b/>
+          <w:bCs/>
+          <w:color w:val="1E293B"/>
+          <w:sz w:val="23"/>
+          <w:szCs w:val="23"/>
+        </w:rPr>
+        <w:t xml:space="preserve">Ce que l'agence y gagne</w:t>
+      </w:r>
+    </w:p>
+    <w:p>
+      <w:pPr>
+        <w:pStyle w:val="ListParagraph"/>
+        <w:numPr>
+          <w:ilvl w:val="0"/>
+          <w:numId w:val="3"/>
+        </w:numPr>
+        <w:spacing w:after="50" w:line="270"/>
+      </w:pPr>
+      <w:r>
+        <w:rPr>
+          <w:rFonts w:ascii="Calibri" w:cs="Calibri" w:eastAsia="Calibri" w:hAnsi="Calibri"/>
+          <w:color w:val="1E293B"/>
+          <w:sz w:val="20"/>
+          <w:szCs w:val="20"/>
+        </w:rPr>
+        <w:t xml:space="preserve">Moins de temps perdu à chercher les dossiers.</w:t>
+      </w:r>
+    </w:p>
+    <w:p>
+      <w:pPr>
+        <w:pStyle w:val="ListParagraph"/>
+        <w:numPr>
+          <w:ilvl w:val="0"/>
+          <w:numId w:val="3"/>
+        </w:numPr>
+        <w:spacing w:after="50" w:line="270"/>
+      </w:pPr>
+      <w:r>
+        <w:rPr>
+          <w:rFonts w:ascii="Calibri" w:cs="Calibri" w:eastAsia="Calibri" w:hAnsi="Calibri"/>
+          <w:color w:val="1E293B"/>
+          <w:sz w:val="20"/>
+          <w:szCs w:val="20"/>
+        </w:rPr>
+        <w:t xml:space="preserve">Fini les erreurs de calcul du reste à payer.</w:t>
+      </w:r>
+    </w:p>
+    <w:p>
+      <w:pPr>
+        <w:pStyle w:val="ListParagraph"/>
+        <w:numPr>
+          <w:ilvl w:val="0"/>
+          <w:numId w:val="3"/>
+        </w:numPr>
+        <w:spacing w:after="50" w:line="270"/>
+      </w:pPr>
+      <w:r>
+        <w:rPr>
+          <w:rFonts w:ascii="Calibri" w:cs="Calibri" w:eastAsia="Calibri" w:hAnsi="Calibri"/>
+          <w:color w:val="1E293B"/>
+          <w:sz w:val="20"/>
+          <w:szCs w:val="20"/>
+        </w:rPr>
+        <w:t xml:space="preserve">Fini les oublis de pièces, de dates limites et de relances.</w:t>
+      </w:r>
+    </w:p>
+    <w:p>
+      <w:pPr>
+        <w:pStyle w:val="ListParagraph"/>
+        <w:numPr>
+          <w:ilvl w:val="0"/>
+          <w:numId w:val="3"/>
+        </w:numPr>
+        <w:spacing w:after="50" w:line="270"/>
+      </w:pPr>
+      <w:r>
+        <w:rPr>
+          <w:rFonts w:ascii="Calibri" w:cs="Calibri" w:eastAsia="Calibri" w:hAnsi="Calibri"/>
+          <w:color w:val="1E293B"/>
+          <w:sz w:val="20"/>
+          <w:szCs w:val="20"/>
+        </w:rPr>
+        <w:t xml:space="preserve">Un outil adapté à la façon de travailler de l'agence.</w:t>
+      </w:r>
+    </w:p>
+    <w:p>
+      <w:pPr>
+        <w:spacing w:after="60"/>
+      </w:pPr>
+    </w:p>
+    <w:p>
+      <w:pPr>
+        <w:spacing w:after="100" w:line="280"/>
+      </w:pPr>
+      <w:r>
+        <w:rPr>
+          <w:rFonts w:ascii="Calibri" w:cs="Calibri" w:eastAsia="Calibri" w:hAnsi="Calibri"/>
+          <w:color w:val="1E293B"/>
+          <w:sz w:val="20"/>
+          <w:szCs w:val="20"/>
+        </w:rPr>
+        <w:t xml:space="preserve">Le détail des fonctionnalités est dans la section « Besoins fonctionnels », et les outils utilisés sont dans la section « Technologies utilisées ».</w:t>
+      </w:r>
+    </w:p>
+    <w:p>
+      <w:pPr>
+        <w:pStyle w:val="Heading1"/>
+        <w:keepNext/>
+        <w:pBdr>
           <w:bottom w:val="single" w:color="F5A01A" w:sz="12" w:space="4"/>
         </w:pBdr>
         <w:spacing w:after="160" w:before="360"/>
@@ -1445,7 +1898,7 @@
           <w:szCs w:val="30"/>
           <w:shd w:fill="F5A01A" w:color="auto" w:val="clear"/>
         </w:rPr>
-        <w:t xml:space="preserve"> 3 </w:t>
+        <w:t xml:space="preserve"> 4 </w:t>
       </w:r>
       <w:r>
         <w:rPr>
@@ -1596,7 +2049,7 @@
                 <w:sz w:val="20"/>
                 <w:szCs w:val="20"/>
               </w:rPr>
-              <w:t xml:space="preserve">Ce qu'il peut faire (à confirmer avec l'agence)</w:t>
+              <w:t xml:space="preserve">Ce qu'il peut faire</w:t>
             </w:r>
           </w:p>
         </w:tc>
@@ -1706,7 +2159,7 @@
                 <w:sz w:val="20"/>
                 <w:szCs w:val="20"/>
               </w:rPr>
-              <w:t xml:space="preserve">Tout voir, suivre les statistiques, gérer les comptes utilisateurs</w:t>
+              <w:t xml:space="preserve">Tout voir et tout faire, suivre les statistiques, créer et gérer les comptes utilisateurs (elle est la seule à pouvoir le faire)</w:t>
             </w:r>
           </w:p>
         </w:tc>
@@ -1816,7 +2269,7 @@
                 <w:sz w:val="20"/>
                 <w:szCs w:val="20"/>
               </w:rPr>
-              <w:t xml:space="preserve">Créer et modifier clients, dossiers et réservations, enregistrer les acomptes, suivre les pièces</w:t>
+              <w:t xml:space="preserve">Créer et modifier clients, dossiers et réservations, enregistrer les acomptes, suivre les pièces, les échéances et les relances. Pas d'accès aux statistiques ni à la gestion des comptes</w:t>
             </w:r>
           </w:p>
         </w:tc>
@@ -1926,7 +2379,1371 @@
                 <w:sz w:val="20"/>
                 <w:szCs w:val="20"/>
               </w:rPr>
-              <w:t xml:space="preserve">Voir et enregistrer les paiements, éditer les reçus, consulter les restes à payer</w:t>
+              <w:t xml:space="preserve">Consulter les clients et les dossiers, enregistrer tous les paiements (acompte, versement, solde), éditer les reçus et les décharges de visa, consulter les restes à payer. Ne crée pas de dossier et n'a pas accès aux pièces et échéances</w:t>
+            </w:r>
+          </w:p>
+        </w:tc>
+      </w:tr>
+    </w:tbl>
+    <w:p>
+      <w:pPr>
+        <w:spacing w:after="120"/>
+      </w:pPr>
+    </w:p>
+    <w:p>
+      <w:pPr>
+        <w:spacing w:after="100" w:line="280"/>
+      </w:pPr>
+      <w:r>
+        <w:rPr>
+          <w:rFonts w:ascii="Calibri" w:cs="Calibri" w:eastAsia="Calibri" w:hAnsi="Calibri"/>
+          <w:color w:val="1E293B"/>
+          <w:sz w:val="20"/>
+          <w:szCs w:val="20"/>
+        </w:rPr>
+        <w:t xml:space="preserve"/>
+      </w:r>
+      <w:r>
+        <w:rPr>
+          <w:rFonts w:ascii="Calibri" w:cs="Calibri" w:eastAsia="Calibri" w:hAnsi="Calibri"/>
+          <w:b/>
+          <w:bCs/>
+          <w:color w:val="1E293B"/>
+          <w:sz w:val="20"/>
+          <w:szCs w:val="20"/>
+        </w:rPr>
+        <w:t xml:space="preserve">Qui peut faire quoi</w:t>
+      </w:r>
+      <w:r>
+        <w:rPr>
+          <w:rFonts w:ascii="Calibri" w:cs="Calibri" w:eastAsia="Calibri" w:hAnsi="Calibri"/>
+          <w:color w:val="1E293B"/>
+          <w:sz w:val="20"/>
+          <w:szCs w:val="20"/>
+        </w:rPr>
+        <w:t xml:space="preserve"> (le menu de l'application change selon le rôle) :</w:t>
+      </w:r>
+    </w:p>
+    <w:tbl>
+      <w:tblPr>
+        <w:tblW w:type="dxa" w:w="9638"/>
+        <w:tblBorders>
+          <w:top w:val="none" w:color="FFFFFF" w:sz="0"/>
+          <w:left w:val="none" w:color="FFFFFF" w:sz="0"/>
+          <w:bottom w:val="none" w:color="FFFFFF" w:sz="0"/>
+          <w:right w:val="none" w:color="FFFFFF" w:sz="0"/>
+          <w:insideH w:val="none" w:color="FFFFFF" w:sz="0"/>
+          <w:insideV w:val="none" w:color="FFFFFF" w:sz="0"/>
+        </w:tblBorders>
+        <w:tblLayout w:type="fixed"/>
+      </w:tblPr>
+      <w:tblGrid>
+        <w:gridCol w:w="3638"/>
+        <w:gridCol w:w="2000"/>
+        <w:gridCol w:w="2000"/>
+        <w:gridCol w:w="2000"/>
+      </w:tblGrid>
+      <w:tr>
+        <w:trPr>
+          <w:tblHeader/>
+        </w:trPr>
+        <w:tc>
+          <w:tcPr>
+            <w:tcW w:type="dxa" w:w="3638"/>
+            <w:tcBorders>
+              <w:top w:val="none" w:color="FFFFFF" w:sz="0"/>
+              <w:left w:val="none" w:color="FFFFFF" w:sz="0"/>
+              <w:bottom w:val="none" w:color="FFFFFF" w:sz="0"/>
+              <w:right w:val="none" w:color="FFFFFF" w:sz="0"/>
+            </w:tcBorders>
+            <w:shd w:fill="1E293B" w:color="auto" w:val="clear"/>
+            <w:tcMar>
+              <w:top w:type="dxa" w:w="100"/>
+              <w:left w:type="dxa" w:w="160"/>
+              <w:bottom w:type="dxa" w:w="100"/>
+              <w:right w:type="dxa" w:w="160"/>
+            </w:tcMar>
+            <w:vAlign w:val="center"/>
+          </w:tcPr>
+          <w:p>
+            <w:pPr>
+              <w:spacing w:after="0"/>
+            </w:pPr>
+            <w:r>
+              <w:rPr>
+                <w:rFonts w:ascii="Calibri" w:cs="Calibri" w:eastAsia="Calibri" w:hAnsi="Calibri"/>
+                <w:b/>
+                <w:bCs/>
+                <w:color w:val="FFFFFF"/>
+                <w:sz w:val="20"/>
+                <w:szCs w:val="20"/>
+              </w:rPr>
+              <w:t xml:space="preserve">Fonction</w:t>
+            </w:r>
+          </w:p>
+        </w:tc>
+        <w:tc>
+          <w:tcPr>
+            <w:tcW w:type="dxa" w:w="2000"/>
+            <w:tcBorders>
+              <w:top w:val="none" w:color="FFFFFF" w:sz="0"/>
+              <w:left w:val="none" w:color="FFFFFF" w:sz="0"/>
+              <w:bottom w:val="none" w:color="FFFFFF" w:sz="0"/>
+              <w:right w:val="none" w:color="FFFFFF" w:sz="0"/>
+            </w:tcBorders>
+            <w:shd w:fill="1E293B" w:color="auto" w:val="clear"/>
+            <w:tcMar>
+              <w:top w:type="dxa" w:w="100"/>
+              <w:left w:type="dxa" w:w="160"/>
+              <w:bottom w:type="dxa" w:w="100"/>
+              <w:right w:type="dxa" w:w="160"/>
+            </w:tcMar>
+            <w:vAlign w:val="center"/>
+          </w:tcPr>
+          <w:p>
+            <w:pPr>
+              <w:spacing w:after="0"/>
+            </w:pPr>
+            <w:r>
+              <w:rPr>
+                <w:rFonts w:ascii="Calibri" w:cs="Calibri" w:eastAsia="Calibri" w:hAnsi="Calibri"/>
+                <w:b/>
+                <w:bCs/>
+                <w:color w:val="FFFFFF"/>
+                <w:sz w:val="20"/>
+                <w:szCs w:val="20"/>
+              </w:rPr>
+              <w:t xml:space="preserve">Directrice</w:t>
+            </w:r>
+          </w:p>
+        </w:tc>
+        <w:tc>
+          <w:tcPr>
+            <w:tcW w:type="dxa" w:w="2000"/>
+            <w:tcBorders>
+              <w:top w:val="none" w:color="FFFFFF" w:sz="0"/>
+              <w:left w:val="none" w:color="FFFFFF" w:sz="0"/>
+              <w:bottom w:val="none" w:color="FFFFFF" w:sz="0"/>
+              <w:right w:val="none" w:color="FFFFFF" w:sz="0"/>
+            </w:tcBorders>
+            <w:shd w:fill="1E293B" w:color="auto" w:val="clear"/>
+            <w:tcMar>
+              <w:top w:type="dxa" w:w="100"/>
+              <w:left w:type="dxa" w:w="160"/>
+              <w:bottom w:type="dxa" w:w="100"/>
+              <w:right w:type="dxa" w:w="160"/>
+            </w:tcMar>
+            <w:vAlign w:val="center"/>
+          </w:tcPr>
+          <w:p>
+            <w:pPr>
+              <w:spacing w:after="0"/>
+            </w:pPr>
+            <w:r>
+              <w:rPr>
+                <w:rFonts w:ascii="Calibri" w:cs="Calibri" w:eastAsia="Calibri" w:hAnsi="Calibri"/>
+                <w:b/>
+                <w:bCs/>
+                <w:color w:val="FFFFFF"/>
+                <w:sz w:val="20"/>
+                <w:szCs w:val="20"/>
+              </w:rPr>
+              <w:t xml:space="preserve">Agent</w:t>
+            </w:r>
+          </w:p>
+        </w:tc>
+        <w:tc>
+          <w:tcPr>
+            <w:tcW w:type="dxa" w:w="2000"/>
+            <w:tcBorders>
+              <w:top w:val="none" w:color="FFFFFF" w:sz="0"/>
+              <w:left w:val="none" w:color="FFFFFF" w:sz="0"/>
+              <w:bottom w:val="none" w:color="FFFFFF" w:sz="0"/>
+              <w:right w:val="none" w:color="FFFFFF" w:sz="0"/>
+            </w:tcBorders>
+            <w:shd w:fill="1E293B" w:color="auto" w:val="clear"/>
+            <w:tcMar>
+              <w:top w:type="dxa" w:w="100"/>
+              <w:left w:type="dxa" w:w="160"/>
+              <w:bottom w:type="dxa" w:w="100"/>
+              <w:right w:type="dxa" w:w="160"/>
+            </w:tcMar>
+            <w:vAlign w:val="center"/>
+          </w:tcPr>
+          <w:p>
+            <w:pPr>
+              <w:spacing w:after="0"/>
+            </w:pPr>
+            <w:r>
+              <w:rPr>
+                <w:rFonts w:ascii="Calibri" w:cs="Calibri" w:eastAsia="Calibri" w:hAnsi="Calibri"/>
+                <w:b/>
+                <w:bCs/>
+                <w:color w:val="FFFFFF"/>
+                <w:sz w:val="20"/>
+                <w:szCs w:val="20"/>
+              </w:rPr>
+              <w:t xml:space="preserve">Comptable</w:t>
+            </w:r>
+          </w:p>
+        </w:tc>
+      </w:tr>
+      <w:tr>
+        <w:trPr>
+          <w:cantSplit/>
+        </w:trPr>
+        <w:tc>
+          <w:tcPr>
+            <w:tcW w:type="dxa" w:w="3638"/>
+            <w:tcBorders>
+              <w:top w:val="none" w:color="FFFFFF" w:sz="0"/>
+              <w:left w:val="none" w:color="FFFFFF" w:sz="0"/>
+              <w:bottom w:val="single" w:color="E2E8F0" w:sz="4"/>
+              <w:right w:val="none" w:color="FFFFFF" w:sz="0"/>
+            </w:tcBorders>
+            <w:shd w:fill="FFFFFF" w:color="auto" w:val="clear"/>
+            <w:tcMar>
+              <w:top w:type="dxa" w:w="100"/>
+              <w:left w:type="dxa" w:w="160"/>
+              <w:bottom w:type="dxa" w:w="100"/>
+              <w:right w:type="dxa" w:w="160"/>
+            </w:tcMar>
+            <w:vAlign w:val="center"/>
+          </w:tcPr>
+          <w:p>
+            <w:pPr>
+              <w:spacing w:after="0"/>
+            </w:pPr>
+            <w:r>
+              <w:rPr>
+                <w:rFonts w:ascii="Calibri" w:cs="Calibri" w:eastAsia="Calibri" w:hAnsi="Calibri"/>
+                <w:b/>
+                <w:bCs/>
+                <w:color w:val="1E293B"/>
+                <w:sz w:val="19"/>
+                <w:szCs w:val="19"/>
+              </w:rPr>
+              <w:t xml:space="preserve">Clients et consultation des dossiers</w:t>
+            </w:r>
+          </w:p>
+        </w:tc>
+        <w:tc>
+          <w:tcPr>
+            <w:tcW w:type="dxa" w:w="2000"/>
+            <w:tcBorders>
+              <w:top w:val="none" w:color="FFFFFF" w:sz="0"/>
+              <w:left w:val="none" w:color="FFFFFF" w:sz="0"/>
+              <w:bottom w:val="single" w:color="E2E8F0" w:sz="4"/>
+              <w:right w:val="none" w:color="FFFFFF" w:sz="0"/>
+            </w:tcBorders>
+            <w:shd w:fill="FFFFFF" w:color="auto" w:val="clear"/>
+            <w:tcMar>
+              <w:top w:type="dxa" w:w="100"/>
+              <w:left w:type="dxa" w:w="160"/>
+              <w:bottom w:type="dxa" w:w="100"/>
+              <w:right w:type="dxa" w:w="160"/>
+            </w:tcMar>
+            <w:vAlign w:val="center"/>
+          </w:tcPr>
+          <w:p>
+            <w:pPr>
+              <w:spacing w:after="0"/>
+            </w:pPr>
+            <w:r>
+              <w:rPr>
+                <w:rFonts w:ascii="Calibri" w:cs="Calibri" w:eastAsia="Calibri" w:hAnsi="Calibri"/>
+                <w:b w:val="false"/>
+                <w:bCs w:val="false"/>
+                <w:color w:val="1E293B"/>
+                <w:sz w:val="19"/>
+                <w:szCs w:val="19"/>
+              </w:rPr>
+              <w:t xml:space="preserve">Tout voir</w:t>
+            </w:r>
+          </w:p>
+        </w:tc>
+        <w:tc>
+          <w:tcPr>
+            <w:tcW w:type="dxa" w:w="2000"/>
+            <w:tcBorders>
+              <w:top w:val="none" w:color="FFFFFF" w:sz="0"/>
+              <w:left w:val="none" w:color="FFFFFF" w:sz="0"/>
+              <w:bottom w:val="single" w:color="E2E8F0" w:sz="4"/>
+              <w:right w:val="none" w:color="FFFFFF" w:sz="0"/>
+            </w:tcBorders>
+            <w:shd w:fill="FFFFFF" w:color="auto" w:val="clear"/>
+            <w:tcMar>
+              <w:top w:type="dxa" w:w="100"/>
+              <w:left w:type="dxa" w:w="160"/>
+              <w:bottom w:type="dxa" w:w="100"/>
+              <w:right w:type="dxa" w:w="160"/>
+            </w:tcMar>
+            <w:vAlign w:val="center"/>
+          </w:tcPr>
+          <w:p>
+            <w:pPr>
+              <w:spacing w:after="0"/>
+            </w:pPr>
+            <w:r>
+              <w:rPr>
+                <w:rFonts w:ascii="Calibri" w:cs="Calibri" w:eastAsia="Calibri" w:hAnsi="Calibri"/>
+                <w:b w:val="false"/>
+                <w:bCs w:val="false"/>
+                <w:color w:val="1E293B"/>
+                <w:sz w:val="19"/>
+                <w:szCs w:val="19"/>
+              </w:rPr>
+              <w:t xml:space="preserve">Oui</w:t>
+            </w:r>
+          </w:p>
+        </w:tc>
+        <w:tc>
+          <w:tcPr>
+            <w:tcW w:type="dxa" w:w="2000"/>
+            <w:tcBorders>
+              <w:top w:val="none" w:color="FFFFFF" w:sz="0"/>
+              <w:left w:val="none" w:color="FFFFFF" w:sz="0"/>
+              <w:bottom w:val="single" w:color="E2E8F0" w:sz="4"/>
+              <w:right w:val="none" w:color="FFFFFF" w:sz="0"/>
+            </w:tcBorders>
+            <w:shd w:fill="FFFFFF" w:color="auto" w:val="clear"/>
+            <w:tcMar>
+              <w:top w:type="dxa" w:w="100"/>
+              <w:left w:type="dxa" w:w="160"/>
+              <w:bottom w:type="dxa" w:w="100"/>
+              <w:right w:type="dxa" w:w="160"/>
+            </w:tcMar>
+            <w:vAlign w:val="center"/>
+          </w:tcPr>
+          <w:p>
+            <w:pPr>
+              <w:spacing w:after="0"/>
+            </w:pPr>
+            <w:r>
+              <w:rPr>
+                <w:rFonts w:ascii="Calibri" w:cs="Calibri" w:eastAsia="Calibri" w:hAnsi="Calibri"/>
+                <w:b w:val="false"/>
+                <w:bCs w:val="false"/>
+                <w:color w:val="1E293B"/>
+                <w:sz w:val="19"/>
+                <w:szCs w:val="19"/>
+              </w:rPr>
+              <w:t xml:space="preserve">Consultation</w:t>
+            </w:r>
+          </w:p>
+        </w:tc>
+      </w:tr>
+      <w:tr>
+        <w:trPr>
+          <w:cantSplit/>
+        </w:trPr>
+        <w:tc>
+          <w:tcPr>
+            <w:tcW w:type="dxa" w:w="3638"/>
+            <w:tcBorders>
+              <w:top w:val="none" w:color="FFFFFF" w:sz="0"/>
+              <w:left w:val="none" w:color="FFFFFF" w:sz="0"/>
+              <w:bottom w:val="single" w:color="E2E8F0" w:sz="4"/>
+              <w:right w:val="none" w:color="FFFFFF" w:sz="0"/>
+            </w:tcBorders>
+            <w:shd w:fill="FFF7E8" w:color="auto" w:val="clear"/>
+            <w:tcMar>
+              <w:top w:type="dxa" w:w="100"/>
+              <w:left w:type="dxa" w:w="160"/>
+              <w:bottom w:type="dxa" w:w="100"/>
+              <w:right w:type="dxa" w:w="160"/>
+            </w:tcMar>
+            <w:vAlign w:val="center"/>
+          </w:tcPr>
+          <w:p>
+            <w:pPr>
+              <w:spacing w:after="0"/>
+            </w:pPr>
+            <w:r>
+              <w:rPr>
+                <w:rFonts w:ascii="Calibri" w:cs="Calibri" w:eastAsia="Calibri" w:hAnsi="Calibri"/>
+                <w:b/>
+                <w:bCs/>
+                <w:color w:val="1E293B"/>
+                <w:sz w:val="19"/>
+                <w:szCs w:val="19"/>
+              </w:rPr>
+              <w:t xml:space="preserve">Création de clients, dossiers et réservations</w:t>
+            </w:r>
+          </w:p>
+        </w:tc>
+        <w:tc>
+          <w:tcPr>
+            <w:tcW w:type="dxa" w:w="2000"/>
+            <w:tcBorders>
+              <w:top w:val="none" w:color="FFFFFF" w:sz="0"/>
+              <w:left w:val="none" w:color="FFFFFF" w:sz="0"/>
+              <w:bottom w:val="single" w:color="E2E8F0" w:sz="4"/>
+              <w:right w:val="none" w:color="FFFFFF" w:sz="0"/>
+            </w:tcBorders>
+            <w:shd w:fill="FFF7E8" w:color="auto" w:val="clear"/>
+            <w:tcMar>
+              <w:top w:type="dxa" w:w="100"/>
+              <w:left w:type="dxa" w:w="160"/>
+              <w:bottom w:type="dxa" w:w="100"/>
+              <w:right w:type="dxa" w:w="160"/>
+            </w:tcMar>
+            <w:vAlign w:val="center"/>
+          </w:tcPr>
+          <w:p>
+            <w:pPr>
+              <w:spacing w:after="0"/>
+            </w:pPr>
+            <w:r>
+              <w:rPr>
+                <w:rFonts w:ascii="Calibri" w:cs="Calibri" w:eastAsia="Calibri" w:hAnsi="Calibri"/>
+                <w:b w:val="false"/>
+                <w:bCs w:val="false"/>
+                <w:color w:val="1E293B"/>
+                <w:sz w:val="19"/>
+                <w:szCs w:val="19"/>
+              </w:rPr>
+              <w:t xml:space="preserve">Oui</w:t>
+            </w:r>
+          </w:p>
+        </w:tc>
+        <w:tc>
+          <w:tcPr>
+            <w:tcW w:type="dxa" w:w="2000"/>
+            <w:tcBorders>
+              <w:top w:val="none" w:color="FFFFFF" w:sz="0"/>
+              <w:left w:val="none" w:color="FFFFFF" w:sz="0"/>
+              <w:bottom w:val="single" w:color="E2E8F0" w:sz="4"/>
+              <w:right w:val="none" w:color="FFFFFF" w:sz="0"/>
+            </w:tcBorders>
+            <w:shd w:fill="FFF7E8" w:color="auto" w:val="clear"/>
+            <w:tcMar>
+              <w:top w:type="dxa" w:w="100"/>
+              <w:left w:type="dxa" w:w="160"/>
+              <w:bottom w:type="dxa" w:w="100"/>
+              <w:right w:type="dxa" w:w="160"/>
+            </w:tcMar>
+            <w:vAlign w:val="center"/>
+          </w:tcPr>
+          <w:p>
+            <w:pPr>
+              <w:spacing w:after="0"/>
+            </w:pPr>
+            <w:r>
+              <w:rPr>
+                <w:rFonts w:ascii="Calibri" w:cs="Calibri" w:eastAsia="Calibri" w:hAnsi="Calibri"/>
+                <w:b w:val="false"/>
+                <w:bCs w:val="false"/>
+                <w:color w:val="1E293B"/>
+                <w:sz w:val="19"/>
+                <w:szCs w:val="19"/>
+              </w:rPr>
+              <w:t xml:space="preserve">Oui</w:t>
+            </w:r>
+          </w:p>
+        </w:tc>
+        <w:tc>
+          <w:tcPr>
+            <w:tcW w:type="dxa" w:w="2000"/>
+            <w:tcBorders>
+              <w:top w:val="none" w:color="FFFFFF" w:sz="0"/>
+              <w:left w:val="none" w:color="FFFFFF" w:sz="0"/>
+              <w:bottom w:val="single" w:color="E2E8F0" w:sz="4"/>
+              <w:right w:val="none" w:color="FFFFFF" w:sz="0"/>
+            </w:tcBorders>
+            <w:shd w:fill="FFF7E8" w:color="auto" w:val="clear"/>
+            <w:tcMar>
+              <w:top w:type="dxa" w:w="100"/>
+              <w:left w:type="dxa" w:w="160"/>
+              <w:bottom w:type="dxa" w:w="100"/>
+              <w:right w:type="dxa" w:w="160"/>
+            </w:tcMar>
+            <w:vAlign w:val="center"/>
+          </w:tcPr>
+          <w:p>
+            <w:pPr>
+              <w:spacing w:after="0"/>
+            </w:pPr>
+            <w:r>
+              <w:rPr>
+                <w:rFonts w:ascii="Calibri" w:cs="Calibri" w:eastAsia="Calibri" w:hAnsi="Calibri"/>
+                <w:b w:val="false"/>
+                <w:bCs w:val="false"/>
+                <w:color w:val="1E293B"/>
+                <w:sz w:val="19"/>
+                <w:szCs w:val="19"/>
+              </w:rPr>
+              <w:t xml:space="preserve">Non</w:t>
+            </w:r>
+          </w:p>
+        </w:tc>
+      </w:tr>
+      <w:tr>
+        <w:trPr>
+          <w:cantSplit/>
+        </w:trPr>
+        <w:tc>
+          <w:tcPr>
+            <w:tcW w:type="dxa" w:w="3638"/>
+            <w:tcBorders>
+              <w:top w:val="none" w:color="FFFFFF" w:sz="0"/>
+              <w:left w:val="none" w:color="FFFFFF" w:sz="0"/>
+              <w:bottom w:val="single" w:color="E2E8F0" w:sz="4"/>
+              <w:right w:val="none" w:color="FFFFFF" w:sz="0"/>
+            </w:tcBorders>
+            <w:shd w:fill="FFFFFF" w:color="auto" w:val="clear"/>
+            <w:tcMar>
+              <w:top w:type="dxa" w:w="100"/>
+              <w:left w:type="dxa" w:w="160"/>
+              <w:bottom w:type="dxa" w:w="100"/>
+              <w:right w:type="dxa" w:w="160"/>
+            </w:tcMar>
+            <w:vAlign w:val="center"/>
+          </w:tcPr>
+          <w:p>
+            <w:pPr>
+              <w:spacing w:after="0"/>
+            </w:pPr>
+            <w:r>
+              <w:rPr>
+                <w:rFonts w:ascii="Calibri" w:cs="Calibri" w:eastAsia="Calibri" w:hAnsi="Calibri"/>
+                <w:b/>
+                <w:bCs/>
+                <w:color w:val="1E293B"/>
+                <w:sz w:val="19"/>
+                <w:szCs w:val="19"/>
+              </w:rPr>
+              <w:t xml:space="preserve">Pièces, échéances et relances (module 3)</w:t>
+            </w:r>
+          </w:p>
+        </w:tc>
+        <w:tc>
+          <w:tcPr>
+            <w:tcW w:type="dxa" w:w="2000"/>
+            <w:tcBorders>
+              <w:top w:val="none" w:color="FFFFFF" w:sz="0"/>
+              <w:left w:val="none" w:color="FFFFFF" w:sz="0"/>
+              <w:bottom w:val="single" w:color="E2E8F0" w:sz="4"/>
+              <w:right w:val="none" w:color="FFFFFF" w:sz="0"/>
+            </w:tcBorders>
+            <w:shd w:fill="FFFFFF" w:color="auto" w:val="clear"/>
+            <w:tcMar>
+              <w:top w:type="dxa" w:w="100"/>
+              <w:left w:type="dxa" w:w="160"/>
+              <w:bottom w:type="dxa" w:w="100"/>
+              <w:right w:type="dxa" w:w="160"/>
+            </w:tcMar>
+            <w:vAlign w:val="center"/>
+          </w:tcPr>
+          <w:p>
+            <w:pPr>
+              <w:spacing w:after="0"/>
+            </w:pPr>
+            <w:r>
+              <w:rPr>
+                <w:rFonts w:ascii="Calibri" w:cs="Calibri" w:eastAsia="Calibri" w:hAnsi="Calibri"/>
+                <w:b w:val="false"/>
+                <w:bCs w:val="false"/>
+                <w:color w:val="1E293B"/>
+                <w:sz w:val="19"/>
+                <w:szCs w:val="19"/>
+              </w:rPr>
+              <w:t xml:space="preserve">Oui</w:t>
+            </w:r>
+          </w:p>
+        </w:tc>
+        <w:tc>
+          <w:tcPr>
+            <w:tcW w:type="dxa" w:w="2000"/>
+            <w:tcBorders>
+              <w:top w:val="none" w:color="FFFFFF" w:sz="0"/>
+              <w:left w:val="none" w:color="FFFFFF" w:sz="0"/>
+              <w:bottom w:val="single" w:color="E2E8F0" w:sz="4"/>
+              <w:right w:val="none" w:color="FFFFFF" w:sz="0"/>
+            </w:tcBorders>
+            <w:shd w:fill="FFFFFF" w:color="auto" w:val="clear"/>
+            <w:tcMar>
+              <w:top w:type="dxa" w:w="100"/>
+              <w:left w:type="dxa" w:w="160"/>
+              <w:bottom w:type="dxa" w:w="100"/>
+              <w:right w:type="dxa" w:w="160"/>
+            </w:tcMar>
+            <w:vAlign w:val="center"/>
+          </w:tcPr>
+          <w:p>
+            <w:pPr>
+              <w:spacing w:after="0"/>
+            </w:pPr>
+            <w:r>
+              <w:rPr>
+                <w:rFonts w:ascii="Calibri" w:cs="Calibri" w:eastAsia="Calibri" w:hAnsi="Calibri"/>
+                <w:b w:val="false"/>
+                <w:bCs w:val="false"/>
+                <w:color w:val="1E293B"/>
+                <w:sz w:val="19"/>
+                <w:szCs w:val="19"/>
+              </w:rPr>
+              <w:t xml:space="preserve">Oui</w:t>
+            </w:r>
+          </w:p>
+        </w:tc>
+        <w:tc>
+          <w:tcPr>
+            <w:tcW w:type="dxa" w:w="2000"/>
+            <w:tcBorders>
+              <w:top w:val="none" w:color="FFFFFF" w:sz="0"/>
+              <w:left w:val="none" w:color="FFFFFF" w:sz="0"/>
+              <w:bottom w:val="single" w:color="E2E8F0" w:sz="4"/>
+              <w:right w:val="none" w:color="FFFFFF" w:sz="0"/>
+            </w:tcBorders>
+            <w:shd w:fill="FFFFFF" w:color="auto" w:val="clear"/>
+            <w:tcMar>
+              <w:top w:type="dxa" w:w="100"/>
+              <w:left w:type="dxa" w:w="160"/>
+              <w:bottom w:type="dxa" w:w="100"/>
+              <w:right w:type="dxa" w:w="160"/>
+            </w:tcMar>
+            <w:vAlign w:val="center"/>
+          </w:tcPr>
+          <w:p>
+            <w:pPr>
+              <w:spacing w:after="0"/>
+            </w:pPr>
+            <w:r>
+              <w:rPr>
+                <w:rFonts w:ascii="Calibri" w:cs="Calibri" w:eastAsia="Calibri" w:hAnsi="Calibri"/>
+                <w:b w:val="false"/>
+                <w:bCs w:val="false"/>
+                <w:color w:val="1E293B"/>
+                <w:sz w:val="19"/>
+                <w:szCs w:val="19"/>
+              </w:rPr>
+              <w:t xml:space="preserve">Non</w:t>
+            </w:r>
+          </w:p>
+        </w:tc>
+      </w:tr>
+      <w:tr>
+        <w:trPr>
+          <w:cantSplit/>
+        </w:trPr>
+        <w:tc>
+          <w:tcPr>
+            <w:tcW w:type="dxa" w:w="3638"/>
+            <w:tcBorders>
+              <w:top w:val="none" w:color="FFFFFF" w:sz="0"/>
+              <w:left w:val="none" w:color="FFFFFF" w:sz="0"/>
+              <w:bottom w:val="single" w:color="E2E8F0" w:sz="4"/>
+              <w:right w:val="none" w:color="FFFFFF" w:sz="0"/>
+            </w:tcBorders>
+            <w:shd w:fill="FFF7E8" w:color="auto" w:val="clear"/>
+            <w:tcMar>
+              <w:top w:type="dxa" w:w="100"/>
+              <w:left w:type="dxa" w:w="160"/>
+              <w:bottom w:type="dxa" w:w="100"/>
+              <w:right w:type="dxa" w:w="160"/>
+            </w:tcMar>
+            <w:vAlign w:val="center"/>
+          </w:tcPr>
+          <w:p>
+            <w:pPr>
+              <w:spacing w:after="0"/>
+            </w:pPr>
+            <w:r>
+              <w:rPr>
+                <w:rFonts w:ascii="Calibri" w:cs="Calibri" w:eastAsia="Calibri" w:hAnsi="Calibri"/>
+                <w:b/>
+                <w:bCs/>
+                <w:color w:val="1E293B"/>
+                <w:sz w:val="19"/>
+                <w:szCs w:val="19"/>
+              </w:rPr>
+              <w:t xml:space="preserve">Enregistrement des paiements</w:t>
+            </w:r>
+          </w:p>
+        </w:tc>
+        <w:tc>
+          <w:tcPr>
+            <w:tcW w:type="dxa" w:w="2000"/>
+            <w:tcBorders>
+              <w:top w:val="none" w:color="FFFFFF" w:sz="0"/>
+              <w:left w:val="none" w:color="FFFFFF" w:sz="0"/>
+              <w:bottom w:val="single" w:color="E2E8F0" w:sz="4"/>
+              <w:right w:val="none" w:color="FFFFFF" w:sz="0"/>
+            </w:tcBorders>
+            <w:shd w:fill="FFF7E8" w:color="auto" w:val="clear"/>
+            <w:tcMar>
+              <w:top w:type="dxa" w:w="100"/>
+              <w:left w:type="dxa" w:w="160"/>
+              <w:bottom w:type="dxa" w:w="100"/>
+              <w:right w:type="dxa" w:w="160"/>
+            </w:tcMar>
+            <w:vAlign w:val="center"/>
+          </w:tcPr>
+          <w:p>
+            <w:pPr>
+              <w:spacing w:after="0"/>
+            </w:pPr>
+            <w:r>
+              <w:rPr>
+                <w:rFonts w:ascii="Calibri" w:cs="Calibri" w:eastAsia="Calibri" w:hAnsi="Calibri"/>
+                <w:b w:val="false"/>
+                <w:bCs w:val="false"/>
+                <w:color w:val="1E293B"/>
+                <w:sz w:val="19"/>
+                <w:szCs w:val="19"/>
+              </w:rPr>
+              <w:t xml:space="preserve">Tous</w:t>
+            </w:r>
+          </w:p>
+        </w:tc>
+        <w:tc>
+          <w:tcPr>
+            <w:tcW w:type="dxa" w:w="2000"/>
+            <w:tcBorders>
+              <w:top w:val="none" w:color="FFFFFF" w:sz="0"/>
+              <w:left w:val="none" w:color="FFFFFF" w:sz="0"/>
+              <w:bottom w:val="single" w:color="E2E8F0" w:sz="4"/>
+              <w:right w:val="none" w:color="FFFFFF" w:sz="0"/>
+            </w:tcBorders>
+            <w:shd w:fill="FFF7E8" w:color="auto" w:val="clear"/>
+            <w:tcMar>
+              <w:top w:type="dxa" w:w="100"/>
+              <w:left w:type="dxa" w:w="160"/>
+              <w:bottom w:type="dxa" w:w="100"/>
+              <w:right w:type="dxa" w:w="160"/>
+            </w:tcMar>
+            <w:vAlign w:val="center"/>
+          </w:tcPr>
+          <w:p>
+            <w:pPr>
+              <w:spacing w:after="0"/>
+            </w:pPr>
+            <w:r>
+              <w:rPr>
+                <w:rFonts w:ascii="Calibri" w:cs="Calibri" w:eastAsia="Calibri" w:hAnsi="Calibri"/>
+                <w:b w:val="false"/>
+                <w:bCs w:val="false"/>
+                <w:color w:val="1E293B"/>
+                <w:sz w:val="19"/>
+                <w:szCs w:val="19"/>
+              </w:rPr>
+              <w:t xml:space="preserve">Acomptes seulement</w:t>
+            </w:r>
+          </w:p>
+        </w:tc>
+        <w:tc>
+          <w:tcPr>
+            <w:tcW w:type="dxa" w:w="2000"/>
+            <w:tcBorders>
+              <w:top w:val="none" w:color="FFFFFF" w:sz="0"/>
+              <w:left w:val="none" w:color="FFFFFF" w:sz="0"/>
+              <w:bottom w:val="single" w:color="E2E8F0" w:sz="4"/>
+              <w:right w:val="none" w:color="FFFFFF" w:sz="0"/>
+            </w:tcBorders>
+            <w:shd w:fill="FFF7E8" w:color="auto" w:val="clear"/>
+            <w:tcMar>
+              <w:top w:type="dxa" w:w="100"/>
+              <w:left w:type="dxa" w:w="160"/>
+              <w:bottom w:type="dxa" w:w="100"/>
+              <w:right w:type="dxa" w:w="160"/>
+            </w:tcMar>
+            <w:vAlign w:val="center"/>
+          </w:tcPr>
+          <w:p>
+            <w:pPr>
+              <w:spacing w:after="0"/>
+            </w:pPr>
+            <w:r>
+              <w:rPr>
+                <w:rFonts w:ascii="Calibri" w:cs="Calibri" w:eastAsia="Calibri" w:hAnsi="Calibri"/>
+                <w:b w:val="false"/>
+                <w:bCs w:val="false"/>
+                <w:color w:val="1E293B"/>
+                <w:sz w:val="19"/>
+                <w:szCs w:val="19"/>
+              </w:rPr>
+              <w:t xml:space="preserve">Tous</w:t>
+            </w:r>
+          </w:p>
+        </w:tc>
+      </w:tr>
+      <w:tr>
+        <w:trPr>
+          <w:cantSplit/>
+        </w:trPr>
+        <w:tc>
+          <w:tcPr>
+            <w:tcW w:type="dxa" w:w="3638"/>
+            <w:tcBorders>
+              <w:top w:val="none" w:color="FFFFFF" w:sz="0"/>
+              <w:left w:val="none" w:color="FFFFFF" w:sz="0"/>
+              <w:bottom w:val="single" w:color="E2E8F0" w:sz="4"/>
+              <w:right w:val="none" w:color="FFFFFF" w:sz="0"/>
+            </w:tcBorders>
+            <w:shd w:fill="FFFFFF" w:color="auto" w:val="clear"/>
+            <w:tcMar>
+              <w:top w:type="dxa" w:w="100"/>
+              <w:left w:type="dxa" w:w="160"/>
+              <w:bottom w:type="dxa" w:w="100"/>
+              <w:right w:type="dxa" w:w="160"/>
+            </w:tcMar>
+            <w:vAlign w:val="center"/>
+          </w:tcPr>
+          <w:p>
+            <w:pPr>
+              <w:spacing w:after="0"/>
+            </w:pPr>
+            <w:r>
+              <w:rPr>
+                <w:rFonts w:ascii="Calibri" w:cs="Calibri" w:eastAsia="Calibri" w:hAnsi="Calibri"/>
+                <w:b/>
+                <w:bCs/>
+                <w:color w:val="1E293B"/>
+                <w:sz w:val="19"/>
+                <w:szCs w:val="19"/>
+              </w:rPr>
+              <w:t xml:space="preserve">Reçus et décharges de visa</w:t>
+            </w:r>
+          </w:p>
+        </w:tc>
+        <w:tc>
+          <w:tcPr>
+            <w:tcW w:type="dxa" w:w="2000"/>
+            <w:tcBorders>
+              <w:top w:val="none" w:color="FFFFFF" w:sz="0"/>
+              <w:left w:val="none" w:color="FFFFFF" w:sz="0"/>
+              <w:bottom w:val="single" w:color="E2E8F0" w:sz="4"/>
+              <w:right w:val="none" w:color="FFFFFF" w:sz="0"/>
+            </w:tcBorders>
+            <w:shd w:fill="FFFFFF" w:color="auto" w:val="clear"/>
+            <w:tcMar>
+              <w:top w:type="dxa" w:w="100"/>
+              <w:left w:type="dxa" w:w="160"/>
+              <w:bottom w:type="dxa" w:w="100"/>
+              <w:right w:type="dxa" w:w="160"/>
+            </w:tcMar>
+            <w:vAlign w:val="center"/>
+          </w:tcPr>
+          <w:p>
+            <w:pPr>
+              <w:spacing w:after="0"/>
+            </w:pPr>
+            <w:r>
+              <w:rPr>
+                <w:rFonts w:ascii="Calibri" w:cs="Calibri" w:eastAsia="Calibri" w:hAnsi="Calibri"/>
+                <w:b w:val="false"/>
+                <w:bCs w:val="false"/>
+                <w:color w:val="1E293B"/>
+                <w:sz w:val="19"/>
+                <w:szCs w:val="19"/>
+              </w:rPr>
+              <w:t xml:space="preserve">Oui</w:t>
+            </w:r>
+          </w:p>
+        </w:tc>
+        <w:tc>
+          <w:tcPr>
+            <w:tcW w:type="dxa" w:w="2000"/>
+            <w:tcBorders>
+              <w:top w:val="none" w:color="FFFFFF" w:sz="0"/>
+              <w:left w:val="none" w:color="FFFFFF" w:sz="0"/>
+              <w:bottom w:val="single" w:color="E2E8F0" w:sz="4"/>
+              <w:right w:val="none" w:color="FFFFFF" w:sz="0"/>
+            </w:tcBorders>
+            <w:shd w:fill="FFFFFF" w:color="auto" w:val="clear"/>
+            <w:tcMar>
+              <w:top w:type="dxa" w:w="100"/>
+              <w:left w:type="dxa" w:w="160"/>
+              <w:bottom w:type="dxa" w:w="100"/>
+              <w:right w:type="dxa" w:w="160"/>
+            </w:tcMar>
+            <w:vAlign w:val="center"/>
+          </w:tcPr>
+          <w:p>
+            <w:pPr>
+              <w:spacing w:after="0"/>
+            </w:pPr>
+            <w:r>
+              <w:rPr>
+                <w:rFonts w:ascii="Calibri" w:cs="Calibri" w:eastAsia="Calibri" w:hAnsi="Calibri"/>
+                <w:b w:val="false"/>
+                <w:bCs w:val="false"/>
+                <w:color w:val="1E293B"/>
+                <w:sz w:val="19"/>
+                <w:szCs w:val="19"/>
+              </w:rPr>
+              <w:t xml:space="preserve">Consultation</w:t>
+            </w:r>
+          </w:p>
+        </w:tc>
+        <w:tc>
+          <w:tcPr>
+            <w:tcW w:type="dxa" w:w="2000"/>
+            <w:tcBorders>
+              <w:top w:val="none" w:color="FFFFFF" w:sz="0"/>
+              <w:left w:val="none" w:color="FFFFFF" w:sz="0"/>
+              <w:bottom w:val="single" w:color="E2E8F0" w:sz="4"/>
+              <w:right w:val="none" w:color="FFFFFF" w:sz="0"/>
+            </w:tcBorders>
+            <w:shd w:fill="FFFFFF" w:color="auto" w:val="clear"/>
+            <w:tcMar>
+              <w:top w:type="dxa" w:w="100"/>
+              <w:left w:type="dxa" w:w="160"/>
+              <w:bottom w:type="dxa" w:w="100"/>
+              <w:right w:type="dxa" w:w="160"/>
+            </w:tcMar>
+            <w:vAlign w:val="center"/>
+          </w:tcPr>
+          <w:p>
+            <w:pPr>
+              <w:spacing w:after="0"/>
+            </w:pPr>
+            <w:r>
+              <w:rPr>
+                <w:rFonts w:ascii="Calibri" w:cs="Calibri" w:eastAsia="Calibri" w:hAnsi="Calibri"/>
+                <w:b w:val="false"/>
+                <w:bCs w:val="false"/>
+                <w:color w:val="1E293B"/>
+                <w:sz w:val="19"/>
+                <w:szCs w:val="19"/>
+              </w:rPr>
+              <w:t xml:space="preserve">Édition</w:t>
+            </w:r>
+          </w:p>
+        </w:tc>
+      </w:tr>
+      <w:tr>
+        <w:trPr>
+          <w:cantSplit/>
+        </w:trPr>
+        <w:tc>
+          <w:tcPr>
+            <w:tcW w:type="dxa" w:w="3638"/>
+            <w:tcBorders>
+              <w:top w:val="none" w:color="FFFFFF" w:sz="0"/>
+              <w:left w:val="none" w:color="FFFFFF" w:sz="0"/>
+              <w:bottom w:val="single" w:color="E2E8F0" w:sz="4"/>
+              <w:right w:val="none" w:color="FFFFFF" w:sz="0"/>
+            </w:tcBorders>
+            <w:shd w:fill="FFF7E8" w:color="auto" w:val="clear"/>
+            <w:tcMar>
+              <w:top w:type="dxa" w:w="100"/>
+              <w:left w:type="dxa" w:w="160"/>
+              <w:bottom w:type="dxa" w:w="100"/>
+              <w:right w:type="dxa" w:w="160"/>
+            </w:tcMar>
+            <w:vAlign w:val="center"/>
+          </w:tcPr>
+          <w:p>
+            <w:pPr>
+              <w:spacing w:after="0"/>
+            </w:pPr>
+            <w:r>
+              <w:rPr>
+                <w:rFonts w:ascii="Calibri" w:cs="Calibri" w:eastAsia="Calibri" w:hAnsi="Calibri"/>
+                <w:b/>
+                <w:bCs/>
+                <w:color w:val="1E293B"/>
+                <w:sz w:val="19"/>
+                <w:szCs w:val="19"/>
+              </w:rPr>
+              <w:t xml:space="preserve">Statistiques</w:t>
+            </w:r>
+          </w:p>
+        </w:tc>
+        <w:tc>
+          <w:tcPr>
+            <w:tcW w:type="dxa" w:w="2000"/>
+            <w:tcBorders>
+              <w:top w:val="none" w:color="FFFFFF" w:sz="0"/>
+              <w:left w:val="none" w:color="FFFFFF" w:sz="0"/>
+              <w:bottom w:val="single" w:color="E2E8F0" w:sz="4"/>
+              <w:right w:val="none" w:color="FFFFFF" w:sz="0"/>
+            </w:tcBorders>
+            <w:shd w:fill="FFF7E8" w:color="auto" w:val="clear"/>
+            <w:tcMar>
+              <w:top w:type="dxa" w:w="100"/>
+              <w:left w:type="dxa" w:w="160"/>
+              <w:bottom w:type="dxa" w:w="100"/>
+              <w:right w:type="dxa" w:w="160"/>
+            </w:tcMar>
+            <w:vAlign w:val="center"/>
+          </w:tcPr>
+          <w:p>
+            <w:pPr>
+              <w:spacing w:after="0"/>
+            </w:pPr>
+            <w:r>
+              <w:rPr>
+                <w:rFonts w:ascii="Calibri" w:cs="Calibri" w:eastAsia="Calibri" w:hAnsi="Calibri"/>
+                <w:b w:val="false"/>
+                <w:bCs w:val="false"/>
+                <w:color w:val="1E293B"/>
+                <w:sz w:val="19"/>
+                <w:szCs w:val="19"/>
+              </w:rPr>
+              <w:t xml:space="preserve">Oui</w:t>
+            </w:r>
+          </w:p>
+        </w:tc>
+        <w:tc>
+          <w:tcPr>
+            <w:tcW w:type="dxa" w:w="2000"/>
+            <w:tcBorders>
+              <w:top w:val="none" w:color="FFFFFF" w:sz="0"/>
+              <w:left w:val="none" w:color="FFFFFF" w:sz="0"/>
+              <w:bottom w:val="single" w:color="E2E8F0" w:sz="4"/>
+              <w:right w:val="none" w:color="FFFFFF" w:sz="0"/>
+            </w:tcBorders>
+            <w:shd w:fill="FFF7E8" w:color="auto" w:val="clear"/>
+            <w:tcMar>
+              <w:top w:type="dxa" w:w="100"/>
+              <w:left w:type="dxa" w:w="160"/>
+              <w:bottom w:type="dxa" w:w="100"/>
+              <w:right w:type="dxa" w:w="160"/>
+            </w:tcMar>
+            <w:vAlign w:val="center"/>
+          </w:tcPr>
+          <w:p>
+            <w:pPr>
+              <w:spacing w:after="0"/>
+            </w:pPr>
+            <w:r>
+              <w:rPr>
+                <w:rFonts w:ascii="Calibri" w:cs="Calibri" w:eastAsia="Calibri" w:hAnsi="Calibri"/>
+                <w:b w:val="false"/>
+                <w:bCs w:val="false"/>
+                <w:color w:val="1E293B"/>
+                <w:sz w:val="19"/>
+                <w:szCs w:val="19"/>
+              </w:rPr>
+              <w:t xml:space="preserve">Non</w:t>
+            </w:r>
+          </w:p>
+        </w:tc>
+        <w:tc>
+          <w:tcPr>
+            <w:tcW w:type="dxa" w:w="2000"/>
+            <w:tcBorders>
+              <w:top w:val="none" w:color="FFFFFF" w:sz="0"/>
+              <w:left w:val="none" w:color="FFFFFF" w:sz="0"/>
+              <w:bottom w:val="single" w:color="E2E8F0" w:sz="4"/>
+              <w:right w:val="none" w:color="FFFFFF" w:sz="0"/>
+            </w:tcBorders>
+            <w:shd w:fill="FFF7E8" w:color="auto" w:val="clear"/>
+            <w:tcMar>
+              <w:top w:type="dxa" w:w="100"/>
+              <w:left w:type="dxa" w:w="160"/>
+              <w:bottom w:type="dxa" w:w="100"/>
+              <w:right w:type="dxa" w:w="160"/>
+            </w:tcMar>
+            <w:vAlign w:val="center"/>
+          </w:tcPr>
+          <w:p>
+            <w:pPr>
+              <w:spacing w:after="0"/>
+            </w:pPr>
+            <w:r>
+              <w:rPr>
+                <w:rFonts w:ascii="Calibri" w:cs="Calibri" w:eastAsia="Calibri" w:hAnsi="Calibri"/>
+                <w:b w:val="false"/>
+                <w:bCs w:val="false"/>
+                <w:color w:val="1E293B"/>
+                <w:sz w:val="19"/>
+                <w:szCs w:val="19"/>
+              </w:rPr>
+              <w:t xml:space="preserve">Non</w:t>
+            </w:r>
+          </w:p>
+        </w:tc>
+      </w:tr>
+      <w:tr>
+        <w:trPr>
+          <w:cantSplit/>
+        </w:trPr>
+        <w:tc>
+          <w:tcPr>
+            <w:tcW w:type="dxa" w:w="3638"/>
+            <w:tcBorders>
+              <w:top w:val="none" w:color="FFFFFF" w:sz="0"/>
+              <w:left w:val="none" w:color="FFFFFF" w:sz="0"/>
+              <w:bottom w:val="single" w:color="E2E8F0" w:sz="4"/>
+              <w:right w:val="none" w:color="FFFFFF" w:sz="0"/>
+            </w:tcBorders>
+            <w:shd w:fill="FFFFFF" w:color="auto" w:val="clear"/>
+            <w:tcMar>
+              <w:top w:type="dxa" w:w="100"/>
+              <w:left w:type="dxa" w:w="160"/>
+              <w:bottom w:type="dxa" w:w="100"/>
+              <w:right w:type="dxa" w:w="160"/>
+            </w:tcMar>
+            <w:vAlign w:val="center"/>
+          </w:tcPr>
+          <w:p>
+            <w:pPr>
+              <w:spacing w:after="0"/>
+            </w:pPr>
+            <w:r>
+              <w:rPr>
+                <w:rFonts w:ascii="Calibri" w:cs="Calibri" w:eastAsia="Calibri" w:hAnsi="Calibri"/>
+                <w:b/>
+                <w:bCs/>
+                <w:color w:val="1E293B"/>
+                <w:sz w:val="19"/>
+                <w:szCs w:val="19"/>
+              </w:rPr>
+              <w:t xml:space="preserve">Création et gestion des comptes</w:t>
+            </w:r>
+          </w:p>
+        </w:tc>
+        <w:tc>
+          <w:tcPr>
+            <w:tcW w:type="dxa" w:w="2000"/>
+            <w:tcBorders>
+              <w:top w:val="none" w:color="FFFFFF" w:sz="0"/>
+              <w:left w:val="none" w:color="FFFFFF" w:sz="0"/>
+              <w:bottom w:val="single" w:color="E2E8F0" w:sz="4"/>
+              <w:right w:val="none" w:color="FFFFFF" w:sz="0"/>
+            </w:tcBorders>
+            <w:shd w:fill="FFFFFF" w:color="auto" w:val="clear"/>
+            <w:tcMar>
+              <w:top w:type="dxa" w:w="100"/>
+              <w:left w:type="dxa" w:w="160"/>
+              <w:bottom w:type="dxa" w:w="100"/>
+              <w:right w:type="dxa" w:w="160"/>
+            </w:tcMar>
+            <w:vAlign w:val="center"/>
+          </w:tcPr>
+          <w:p>
+            <w:pPr>
+              <w:spacing w:after="0"/>
+            </w:pPr>
+            <w:r>
+              <w:rPr>
+                <w:rFonts w:ascii="Calibri" w:cs="Calibri" w:eastAsia="Calibri" w:hAnsi="Calibri"/>
+                <w:b w:val="false"/>
+                <w:bCs w:val="false"/>
+                <w:color w:val="1E293B"/>
+                <w:sz w:val="19"/>
+                <w:szCs w:val="19"/>
+              </w:rPr>
+              <w:t xml:space="preserve">Oui</w:t>
+            </w:r>
+          </w:p>
+        </w:tc>
+        <w:tc>
+          <w:tcPr>
+            <w:tcW w:type="dxa" w:w="2000"/>
+            <w:tcBorders>
+              <w:top w:val="none" w:color="FFFFFF" w:sz="0"/>
+              <w:left w:val="none" w:color="FFFFFF" w:sz="0"/>
+              <w:bottom w:val="single" w:color="E2E8F0" w:sz="4"/>
+              <w:right w:val="none" w:color="FFFFFF" w:sz="0"/>
+            </w:tcBorders>
+            <w:shd w:fill="FFFFFF" w:color="auto" w:val="clear"/>
+            <w:tcMar>
+              <w:top w:type="dxa" w:w="100"/>
+              <w:left w:type="dxa" w:w="160"/>
+              <w:bottom w:type="dxa" w:w="100"/>
+              <w:right w:type="dxa" w:w="160"/>
+            </w:tcMar>
+            <w:vAlign w:val="center"/>
+          </w:tcPr>
+          <w:p>
+            <w:pPr>
+              <w:spacing w:after="0"/>
+            </w:pPr>
+            <w:r>
+              <w:rPr>
+                <w:rFonts w:ascii="Calibri" w:cs="Calibri" w:eastAsia="Calibri" w:hAnsi="Calibri"/>
+                <w:b w:val="false"/>
+                <w:bCs w:val="false"/>
+                <w:color w:val="1E293B"/>
+                <w:sz w:val="19"/>
+                <w:szCs w:val="19"/>
+              </w:rPr>
+              <w:t xml:space="preserve">Non</w:t>
+            </w:r>
+          </w:p>
+        </w:tc>
+        <w:tc>
+          <w:tcPr>
+            <w:tcW w:type="dxa" w:w="2000"/>
+            <w:tcBorders>
+              <w:top w:val="none" w:color="FFFFFF" w:sz="0"/>
+              <w:left w:val="none" w:color="FFFFFF" w:sz="0"/>
+              <w:bottom w:val="single" w:color="E2E8F0" w:sz="4"/>
+              <w:right w:val="none" w:color="FFFFFF" w:sz="0"/>
+            </w:tcBorders>
+            <w:shd w:fill="FFFFFF" w:color="auto" w:val="clear"/>
+            <w:tcMar>
+              <w:top w:type="dxa" w:w="100"/>
+              <w:left w:type="dxa" w:w="160"/>
+              <w:bottom w:type="dxa" w:w="100"/>
+              <w:right w:type="dxa" w:w="160"/>
+            </w:tcMar>
+            <w:vAlign w:val="center"/>
+          </w:tcPr>
+          <w:p>
+            <w:pPr>
+              <w:spacing w:after="0"/>
+            </w:pPr>
+            <w:r>
+              <w:rPr>
+                <w:rFonts w:ascii="Calibri" w:cs="Calibri" w:eastAsia="Calibri" w:hAnsi="Calibri"/>
+                <w:b w:val="false"/>
+                <w:bCs w:val="false"/>
+                <w:color w:val="1E293B"/>
+                <w:sz w:val="19"/>
+                <w:szCs w:val="19"/>
+              </w:rPr>
+              <w:t xml:space="preserve">Non</w:t>
+            </w:r>
+          </w:p>
+        </w:tc>
+      </w:tr>
+      <w:tr>
+        <w:trPr>
+          <w:cantSplit/>
+        </w:trPr>
+        <w:tc>
+          <w:tcPr>
+            <w:tcW w:type="dxa" w:w="3638"/>
+            <w:tcBorders>
+              <w:top w:val="none" w:color="FFFFFF" w:sz="0"/>
+              <w:left w:val="none" w:color="FFFFFF" w:sz="0"/>
+              <w:bottom w:val="single" w:color="E2E8F0" w:sz="4"/>
+              <w:right w:val="none" w:color="FFFFFF" w:sz="0"/>
+            </w:tcBorders>
+            <w:shd w:fill="FFF7E8" w:color="auto" w:val="clear"/>
+            <w:tcMar>
+              <w:top w:type="dxa" w:w="100"/>
+              <w:left w:type="dxa" w:w="160"/>
+              <w:bottom w:type="dxa" w:w="100"/>
+              <w:right w:type="dxa" w:w="160"/>
+            </w:tcMar>
+            <w:vAlign w:val="center"/>
+          </w:tcPr>
+          <w:p>
+            <w:pPr>
+              <w:spacing w:after="0"/>
+            </w:pPr>
+            <w:r>
+              <w:rPr>
+                <w:rFonts w:ascii="Calibri" w:cs="Calibri" w:eastAsia="Calibri" w:hAnsi="Calibri"/>
+                <w:b/>
+                <w:bCs/>
+                <w:color w:val="1E293B"/>
+                <w:sz w:val="19"/>
+                <w:szCs w:val="19"/>
+              </w:rPr>
+              <w:t xml:space="preserve">Menu affiché</w:t>
+            </w:r>
+          </w:p>
+        </w:tc>
+        <w:tc>
+          <w:tcPr>
+            <w:tcW w:type="dxa" w:w="2000"/>
+            <w:tcBorders>
+              <w:top w:val="none" w:color="FFFFFF" w:sz="0"/>
+              <w:left w:val="none" w:color="FFFFFF" w:sz="0"/>
+              <w:bottom w:val="single" w:color="E2E8F0" w:sz="4"/>
+              <w:right w:val="none" w:color="FFFFFF" w:sz="0"/>
+            </w:tcBorders>
+            <w:shd w:fill="FFF7E8" w:color="auto" w:val="clear"/>
+            <w:tcMar>
+              <w:top w:type="dxa" w:w="100"/>
+              <w:left w:type="dxa" w:w="160"/>
+              <w:bottom w:type="dxa" w:w="100"/>
+              <w:right w:type="dxa" w:w="160"/>
+            </w:tcMar>
+            <w:vAlign w:val="center"/>
+          </w:tcPr>
+          <w:p>
+            <w:pPr>
+              <w:spacing w:after="0"/>
+            </w:pPr>
+            <w:r>
+              <w:rPr>
+                <w:rFonts w:ascii="Calibri" w:cs="Calibri" w:eastAsia="Calibri" w:hAnsi="Calibri"/>
+                <w:b w:val="false"/>
+                <w:bCs w:val="false"/>
+                <w:color w:val="1E293B"/>
+                <w:sz w:val="19"/>
+                <w:szCs w:val="19"/>
+              </w:rPr>
+              <w:t xml:space="preserve">Tous les menus</w:t>
+            </w:r>
+          </w:p>
+        </w:tc>
+        <w:tc>
+          <w:tcPr>
+            <w:tcW w:type="dxa" w:w="2000"/>
+            <w:tcBorders>
+              <w:top w:val="none" w:color="FFFFFF" w:sz="0"/>
+              <w:left w:val="none" w:color="FFFFFF" w:sz="0"/>
+              <w:bottom w:val="single" w:color="E2E8F0" w:sz="4"/>
+              <w:right w:val="none" w:color="FFFFFF" w:sz="0"/>
+            </w:tcBorders>
+            <w:shd w:fill="FFF7E8" w:color="auto" w:val="clear"/>
+            <w:tcMar>
+              <w:top w:type="dxa" w:w="100"/>
+              <w:left w:type="dxa" w:w="160"/>
+              <w:bottom w:type="dxa" w:w="100"/>
+              <w:right w:type="dxa" w:w="160"/>
+            </w:tcMar>
+            <w:vAlign w:val="center"/>
+          </w:tcPr>
+          <w:p>
+            <w:pPr>
+              <w:spacing w:after="0"/>
+            </w:pPr>
+            <w:r>
+              <w:rPr>
+                <w:rFonts w:ascii="Calibri" w:cs="Calibri" w:eastAsia="Calibri" w:hAnsi="Calibri"/>
+                <w:b w:val="false"/>
+                <w:bCs w:val="false"/>
+                <w:color w:val="1E293B"/>
+                <w:sz w:val="19"/>
+                <w:szCs w:val="19"/>
+              </w:rPr>
+              <w:t xml:space="preserve">Tableau de bord, Clients, Dossiers, Paiements (acomptes), Pièces et échéances</w:t>
+            </w:r>
+          </w:p>
+        </w:tc>
+        <w:tc>
+          <w:tcPr>
+            <w:tcW w:type="dxa" w:w="2000"/>
+            <w:tcBorders>
+              <w:top w:val="none" w:color="FFFFFF" w:sz="0"/>
+              <w:left w:val="none" w:color="FFFFFF" w:sz="0"/>
+              <w:bottom w:val="single" w:color="E2E8F0" w:sz="4"/>
+              <w:right w:val="none" w:color="FFFFFF" w:sz="0"/>
+            </w:tcBorders>
+            <w:shd w:fill="FFF7E8" w:color="auto" w:val="clear"/>
+            <w:tcMar>
+              <w:top w:type="dxa" w:w="100"/>
+              <w:left w:type="dxa" w:w="160"/>
+              <w:bottom w:type="dxa" w:w="100"/>
+              <w:right w:type="dxa" w:w="160"/>
+            </w:tcMar>
+            <w:vAlign w:val="center"/>
+          </w:tcPr>
+          <w:p>
+            <w:pPr>
+              <w:spacing w:after="0"/>
+            </w:pPr>
+            <w:r>
+              <w:rPr>
+                <w:rFonts w:ascii="Calibri" w:cs="Calibri" w:eastAsia="Calibri" w:hAnsi="Calibri"/>
+                <w:b w:val="false"/>
+                <w:bCs w:val="false"/>
+                <w:color w:val="1E293B"/>
+                <w:sz w:val="19"/>
+                <w:szCs w:val="19"/>
+              </w:rPr>
+              <w:t xml:space="preserve">Tableau de bord, Clients, Dossiers, Paiements</w:t>
             </w:r>
           </w:p>
         </w:tc>
@@ -1951,7 +3768,7 @@
           <w:szCs w:val="30"/>
           <w:shd w:fill="F5A01A" w:color="auto" w:val="clear"/>
         </w:rPr>
-        <w:t xml:space="preserve"> 4 </w:t>
+        <w:t xml:space="preserve"> 5 </w:t>
       </w:r>
       <w:r>
         <w:rPr>
@@ -2553,7 +4370,7 @@
           <w:szCs w:val="30"/>
           <w:shd w:fill="F5A01A" w:color="auto" w:val="clear"/>
         </w:rPr>
-        <w:t xml:space="preserve"> 5 </w:t>
+        <w:t xml:space="preserve"> 6 </w:t>
       </w:r>
       <w:r>
         <w:rPr>
@@ -2695,7 +4512,7 @@
           <w:sz w:val="20"/>
           <w:szCs w:val="20"/>
         </w:rPr>
-        <w:t xml:space="preserve">Créer, modifier et rechercher un client (nom complet, téléphone, email, pièce d'identité).</w:t>
+        <w:t xml:space="preserve">Créer, modifier et rechercher un client : civilité (Mr, Mme ou Mlle), nom, prénom, téléphone, email, type et numéro de pièce d'identité.</w:t>
       </w:r>
     </w:p>
     <w:p>
@@ -2714,7 +4531,7 @@
           <w:sz w:val="20"/>
           <w:szCs w:val="20"/>
         </w:rPr>
-        <w:t xml:space="preserve">Créer un dossier lié à un client, avec la destination, la date de voyage et le type de service (billet, visa, hôtel, circuit).</w:t>
+        <w:t xml:space="preserve">Après la création d'un client, passer directement à la création de son dossier.</w:t>
       </w:r>
     </w:p>
     <w:p>
@@ -2733,7 +4550,7 @@
           <w:sz w:val="20"/>
           <w:szCs w:val="20"/>
         </w:rPr>
-        <w:t xml:space="preserve">Suivre l'étape du dossier (contact, besoin noté, devis, acompte, réservation, pièces, remise des documents et départ).</w:t>
+        <w:t xml:space="preserve">Créer un dossier lié à un client, avec le type de service (billet, visa, hôtel, circuit), le pays et la ville de destination, la date de voyage, le montant total et l'agent responsable. Le numéro de dossier est créé automatiquement.</w:t>
       </w:r>
     </w:p>
     <w:p>
@@ -2752,7 +4569,7 @@
           <w:sz w:val="20"/>
           <w:szCs w:val="20"/>
         </w:rPr>
-        <w:t xml:space="preserve">Retrouver un dossier par nom, téléphone ou numéro de dossier.</w:t>
+        <w:t xml:space="preserve">Suivre l'étape du dossier (contact, besoin noté, devis, acompte, réservation, pièces, remise des documents et départ).</w:t>
       </w:r>
     </w:p>
     <w:p>
@@ -2771,7 +4588,45 @@
           <w:sz w:val="20"/>
           <w:szCs w:val="20"/>
         </w:rPr>
-        <w:t xml:space="preserve">Historique des actions sur chaque dossier.</w:t>
+        <w:t xml:space="preserve">Retrouver un client ou un dossier par nom, téléphone ou numéro de dossier, avec des filtres (service, statut).</w:t>
+      </w:r>
+    </w:p>
+    <w:p>
+      <w:pPr>
+        <w:pStyle w:val="ListParagraph"/>
+        <w:numPr>
+          <w:ilvl w:val="0"/>
+          <w:numId w:val="4"/>
+        </w:numPr>
+        <w:spacing w:after="50" w:line="270"/>
+      </w:pPr>
+      <w:r>
+        <w:rPr>
+          <w:rFonts w:ascii="Calibri" w:cs="Calibri" w:eastAsia="Calibri" w:hAnsi="Calibri"/>
+          <w:color w:val="1E293B"/>
+          <w:sz w:val="20"/>
+          <w:szCs w:val="20"/>
+        </w:rPr>
+        <w:t xml:space="preserve">Une fiche dossier qui regroupe tout : étapes, résumé financier (montant total, payé, reste à payer), paiements, réservations, pièces, échéances et historique.</w:t>
+      </w:r>
+    </w:p>
+    <w:p>
+      <w:pPr>
+        <w:pStyle w:val="ListParagraph"/>
+        <w:numPr>
+          <w:ilvl w:val="0"/>
+          <w:numId w:val="4"/>
+        </w:numPr>
+        <w:spacing w:after="50" w:line="270"/>
+      </w:pPr>
+      <w:r>
+        <w:rPr>
+          <w:rFonts w:ascii="Calibri" w:cs="Calibri" w:eastAsia="Calibri" w:hAnsi="Calibri"/>
+          <w:color w:val="1E293B"/>
+          <w:sz w:val="20"/>
+          <w:szCs w:val="20"/>
+        </w:rPr>
+        <w:t xml:space="preserve">Historique des actions sur chaque dossier, avec la date, l'heure et la personne qui a agi.</w:t>
       </w:r>
     </w:p>
     <w:p>
@@ -2893,7 +4748,7 @@
           <w:sz w:val="20"/>
           <w:szCs w:val="20"/>
         </w:rPr>
-        <w:t xml:space="preserve">Enregistrer une réservation (type de service, fournisseur ou plateforme, dates, montant).</w:t>
+        <w:t xml:space="preserve">Enregistrer une ou plusieurs réservations par dossier (type de service, fournisseur ou plateforme, date de début et de fin, montant, état). Une réservation n'est pas un paiement.</w:t>
       </w:r>
     </w:p>
     <w:p>
@@ -2912,7 +4767,7 @@
           <w:sz w:val="20"/>
           <w:szCs w:val="20"/>
         </w:rPr>
-        <w:t xml:space="preserve">Enregistrer chaque paiement : montant, date, moyen (espèces, Wave ou Mobile Money, virement).</w:t>
+        <w:t xml:space="preserve">Enregistrer chaque paiement : montant, date, moyen (espèces, Wave ou Mobile Money, virement) et type (acompte, versement ou solde).</w:t>
       </w:r>
     </w:p>
     <w:p>
@@ -2931,7 +4786,7 @@
           <w:sz w:val="20"/>
           <w:szCs w:val="20"/>
         </w:rPr>
-        <w:t xml:space="preserve">Calculer automatiquement le total payé et le reste à payer.</w:t>
+        <w:t xml:space="preserve">Afficher la situation du dossier pendant la saisie (montant total, déjà payé, reste à payer) et le reste après le versement.</w:t>
       </w:r>
     </w:p>
     <w:p>
@@ -2950,7 +4805,7 @@
           <w:sz w:val="20"/>
           <w:szCs w:val="20"/>
         </w:rPr>
-        <w:t xml:space="preserve">Suivre les deux versements prévus : 50 % à la réservation, 50 % avant le départ.</w:t>
+        <w:t xml:space="preserve">Calculer automatiquement le total payé et le reste à payer.</w:t>
       </w:r>
     </w:p>
     <w:p>
@@ -2969,7 +4824,26 @@
           <w:sz w:val="20"/>
           <w:szCs w:val="20"/>
         </w:rPr>
-        <w:t xml:space="preserve">Éditer un reçu numéroté, imprimable, pour chaque paiement.</w:t>
+        <w:t xml:space="preserve">Suivre les deux versements prévus (50 % à la réservation, 50 % avant le départ) et avertir, sans bloquer, quand un acompte est inférieur à la moitié ou quand un montant dépasse le reste à payer ; la personne confirme ou annule.</w:t>
+      </w:r>
+    </w:p>
+    <w:p>
+      <w:pPr>
+        <w:pStyle w:val="ListParagraph"/>
+        <w:numPr>
+          <w:ilvl w:val="0"/>
+          <w:numId w:val="5"/>
+        </w:numPr>
+        <w:spacing w:after="50" w:line="270"/>
+      </w:pPr>
+      <w:r>
+        <w:rPr>
+          <w:rFonts w:ascii="Calibri" w:cs="Calibri" w:eastAsia="Calibri" w:hAnsi="Calibri"/>
+          <w:color w:val="1E293B"/>
+          <w:sz w:val="20"/>
+          <w:szCs w:val="20"/>
+        </w:rPr>
+        <w:t xml:space="preserve">Éditer un reçu numéroté, imprimable en deux exemplaires, pour chaque paiement : client, dossier, type, moyen, date, montant en chiffres et en lettres, total du dossier, reste à payer, personne qui a enregistré le paiement, zone de signature et cachet.</w:t>
       </w:r>
     </w:p>
     <w:p>
@@ -3351,7 +5225,7 @@
           <w:sz w:val="20"/>
           <w:szCs w:val="20"/>
         </w:rPr>
-        <w:t xml:space="preserve">Alertes sur les échéances proches et les départs proches.</w:t>
+        <w:t xml:space="preserve">Alertes sur les échéances proches et les départs proches (par exemple « Départ dans 3 jours », « Dépôt J-2 »).</w:t>
       </w:r>
     </w:p>
     <w:p>
@@ -3370,7 +5244,26 @@
           <w:sz w:val="20"/>
           <w:szCs w:val="20"/>
         </w:rPr>
-        <w:t xml:space="preserve">Rappel des relances clients à faire.</w:t>
+        <w:t xml:space="preserve">Liste des pièces manquantes de tous les dossiers, avec les dates limites (paiement, dépôt de visa, départ).</w:t>
+      </w:r>
+    </w:p>
+    <w:p>
+      <w:pPr>
+        <w:pStyle w:val="ListParagraph"/>
+        <w:numPr>
+          <w:ilvl w:val="0"/>
+          <w:numId w:val="6"/>
+        </w:numPr>
+        <w:spacing w:after="50" w:line="270"/>
+      </w:pPr>
+      <w:r>
+        <w:rPr>
+          <w:rFonts w:ascii="Calibri" w:cs="Calibri" w:eastAsia="Calibri" w:hAnsi="Calibri"/>
+          <w:color w:val="1E293B"/>
+          <w:sz w:val="20"/>
+          <w:szCs w:val="20"/>
+        </w:rPr>
+        <w:t xml:space="preserve">Rappel des relances clients à faire : date, dossier, action prévue, responsable et état (aujourd'hui, à préparer, à venir).</w:t>
       </w:r>
     </w:p>
     <w:p>
@@ -3492,7 +5385,7 @@
           <w:sz w:val="20"/>
           <w:szCs w:val="20"/>
         </w:rPr>
-        <w:t xml:space="preserve">Un écran d'accueil qui répond en un clic à trois questions : qui doit encore payer, quels papiers manquent, qui voyage bientôt.</w:t>
+        <w:t xml:space="preserve">Un écran d'accueil qui répond en un clic à trois questions : qui doit encore payer, quels papiers manquent, qui voyage bientôt, avec la liste des relances à faire et des boutons rapides (Nouveau dossier, Enregistrer un paiement).</w:t>
       </w:r>
     </w:p>
     <w:p>
@@ -3511,7 +5404,83 @@
           <w:sz w:val="20"/>
           <w:szCs w:val="20"/>
         </w:rPr>
-        <w:t xml:space="preserve">Connexion par identifiant et mot de passe, avec des droits différents selon le rôle.</w:t>
+        <w:t xml:space="preserve">Un tableau de bord adapté à chaque rôle : vue de toute l'agence pour la directrice, dossiers suivis pour l'agent, paiements et reçus récents pour la comptable.</w:t>
+      </w:r>
+    </w:p>
+    <w:p>
+      <w:pPr>
+        <w:pStyle w:val="ListParagraph"/>
+        <w:numPr>
+          <w:ilvl w:val="0"/>
+          <w:numId w:val="7"/>
+        </w:numPr>
+        <w:spacing w:after="50" w:line="270"/>
+      </w:pPr>
+      <w:r>
+        <w:rPr>
+          <w:rFonts w:ascii="Calibri" w:cs="Calibri" w:eastAsia="Calibri" w:hAnsi="Calibri"/>
+          <w:color w:val="1E293B"/>
+          <w:sz w:val="20"/>
+          <w:szCs w:val="20"/>
+        </w:rPr>
+        <w:t xml:space="preserve">Statistiques (directrice uniquement) : dossiers par service et par destination, paiements du mois, restes à encaisser, encaissements par service, avec le choix de la période. Les autres rôles voient le message « Accès réservé à la directrice ».</w:t>
+      </w:r>
+    </w:p>
+    <w:p>
+      <w:pPr>
+        <w:pStyle w:val="ListParagraph"/>
+        <w:numPr>
+          <w:ilvl w:val="0"/>
+          <w:numId w:val="7"/>
+        </w:numPr>
+        <w:spacing w:after="50" w:line="270"/>
+      </w:pPr>
+      <w:r>
+        <w:rPr>
+          <w:rFonts w:ascii="Calibri" w:cs="Calibri" w:eastAsia="Calibri" w:hAnsi="Calibri"/>
+          <w:color w:val="1E293B"/>
+          <w:sz w:val="20"/>
+          <w:szCs w:val="20"/>
+        </w:rPr>
+        <w:t xml:space="preserve">Gestion des comptes (directrice uniquement) : créer un compte (nom, identifiant, mot de passe, un seul rôle), le modifier, et voir l'état de chaque compte (actif ou inactif).</w:t>
+      </w:r>
+    </w:p>
+    <w:p>
+      <w:pPr>
+        <w:pStyle w:val="ListParagraph"/>
+        <w:numPr>
+          <w:ilvl w:val="0"/>
+          <w:numId w:val="7"/>
+        </w:numPr>
+        <w:spacing w:after="50" w:line="270"/>
+      </w:pPr>
+      <w:r>
+        <w:rPr>
+          <w:rFonts w:ascii="Calibri" w:cs="Calibri" w:eastAsia="Calibri" w:hAnsi="Calibri"/>
+          <w:color w:val="1E293B"/>
+          <w:sz w:val="20"/>
+          <w:szCs w:val="20"/>
+        </w:rPr>
+        <w:t xml:space="preserve">Connexion par identifiant et mot de passe, avec des droits et un menu différents selon le rôle. Option « Se souvenir de moi » ; en cas de mot de passe oublié, la directrice le réinitialise.</w:t>
+      </w:r>
+    </w:p>
+    <w:p>
+      <w:pPr>
+        <w:pStyle w:val="ListParagraph"/>
+        <w:numPr>
+          <w:ilvl w:val="0"/>
+          <w:numId w:val="7"/>
+        </w:numPr>
+        <w:spacing w:after="50" w:line="270"/>
+      </w:pPr>
+      <w:r>
+        <w:rPr>
+          <w:rFonts w:ascii="Calibri" w:cs="Calibri" w:eastAsia="Calibri" w:hAnsi="Calibri"/>
+          <w:color w:val="1E293B"/>
+          <w:sz w:val="20"/>
+          <w:szCs w:val="20"/>
+        </w:rPr>
+        <w:t xml:space="preserve">Pas d'inscription publique : les clients n'ont pas de compte. Bouton « Se déconnecter » sur chaque écran.</w:t>
       </w:r>
     </w:p>
     <w:p>
@@ -3533,7 +5502,7 @@
           <w:szCs w:val="30"/>
           <w:shd w:fill="F5A01A" w:color="auto" w:val="clear"/>
         </w:rPr>
-        <w:t xml:space="preserve"> 6 </w:t>
+        <w:t xml:space="preserve"> 7 </w:t>
       </w:r>
       <w:r>
         <w:rPr>
@@ -3577,7 +5546,27 @@
           <w:sz w:val="20"/>
           <w:szCs w:val="20"/>
         </w:rPr>
-        <w:t xml:space="preserve">Un client peut avoir plusieurs dossiers ; un dossier appartient à un seul client.</w:t>
+        <w:t xml:space="preserve"/>
+      </w:r>
+      <w:r>
+        <w:rPr>
+          <w:rFonts w:ascii="Calibri" w:cs="Calibri" w:eastAsia="Calibri" w:hAnsi="Calibri"/>
+          <w:b/>
+          <w:bCs/>
+          <w:color w:val="1E293B"/>
+          <w:sz w:val="20"/>
+          <w:szCs w:val="20"/>
+        </w:rPr>
+        <w:t xml:space="preserve">RG1</w:t>
+      </w:r>
+      <w:r>
+        <w:rPr>
+          <w:rFonts w:ascii="Calibri" w:cs="Calibri" w:eastAsia="Calibri" w:hAnsi="Calibri"/>
+          <w:color w:val="1E293B"/>
+          <w:sz w:val="20"/>
+          <w:szCs w:val="20"/>
+        </w:rPr>
+        <w:t xml:space="preserve"> : Un client peut avoir zéro, un ou plusieurs dossiers ; un dossier appartient à un seul client.</w:t>
       </w:r>
     </w:p>
     <w:p>
@@ -3596,7 +5585,27 @@
           <w:sz w:val="20"/>
           <w:szCs w:val="20"/>
         </w:rPr>
-        <w:t xml:space="preserve">Un dossier concerne un type de service : billet, visa, hôtel ou circuit.</w:t>
+        <w:t xml:space="preserve"/>
+      </w:r>
+      <w:r>
+        <w:rPr>
+          <w:rFonts w:ascii="Calibri" w:cs="Calibri" w:eastAsia="Calibri" w:hAnsi="Calibri"/>
+          <w:b/>
+          <w:bCs/>
+          <w:color w:val="1E293B"/>
+          <w:sz w:val="20"/>
+          <w:szCs w:val="20"/>
+        </w:rPr>
+        <w:t xml:space="preserve">RG2</w:t>
+      </w:r>
+      <w:r>
+        <w:rPr>
+          <w:rFonts w:ascii="Calibri" w:cs="Calibri" w:eastAsia="Calibri" w:hAnsi="Calibri"/>
+          <w:color w:val="1E293B"/>
+          <w:sz w:val="20"/>
+          <w:szCs w:val="20"/>
+        </w:rPr>
+        <w:t xml:space="preserve"> : Chaque dossier a un seul agent responsable, qui le suit du début à la fin ; un agent peut suivre plusieurs dossiers.</w:t>
       </w:r>
     </w:p>
     <w:p>
@@ -3615,7 +5624,27 @@
           <w:sz w:val="20"/>
           <w:szCs w:val="20"/>
         </w:rPr>
-        <w:t xml:space="preserve">Le paiement se fait en deux versements : 50 % à la réservation, 50 % avant le départ.</w:t>
+        <w:t xml:space="preserve"/>
+      </w:r>
+      <w:r>
+        <w:rPr>
+          <w:rFonts w:ascii="Calibri" w:cs="Calibri" w:eastAsia="Calibri" w:hAnsi="Calibri"/>
+          <w:b/>
+          <w:bCs/>
+          <w:color w:val="1E293B"/>
+          <w:sz w:val="20"/>
+          <w:szCs w:val="20"/>
+        </w:rPr>
+        <w:t xml:space="preserve">RG3</w:t>
+      </w:r>
+      <w:r>
+        <w:rPr>
+          <w:rFonts w:ascii="Calibri" w:cs="Calibri" w:eastAsia="Calibri" w:hAnsi="Calibri"/>
+          <w:color w:val="1E293B"/>
+          <w:sz w:val="20"/>
+          <w:szCs w:val="20"/>
+        </w:rPr>
+        <w:t xml:space="preserve"> : Un dossier concerne un seul type de service : billet, visa, hôtel ou circuit.</w:t>
       </w:r>
     </w:p>
     <w:p>
@@ -3645,16 +5674,16 @@
           <w:sz w:val="20"/>
           <w:szCs w:val="20"/>
         </w:rPr>
-        <w:t xml:space="preserve">Reste à payer = montant total du dossier – somme des paiements enregistrés.</w:t>
-      </w:r>
-      <w:r>
-        <w:rPr>
-          <w:rFonts w:ascii="Calibri" w:cs="Calibri" w:eastAsia="Calibri" w:hAnsi="Calibri"/>
-          <w:color w:val="1E293B"/>
-          <w:sz w:val="20"/>
-          <w:szCs w:val="20"/>
-        </w:rPr>
-        <w:t xml:space="preserve"/>
+        <w:t xml:space="preserve">RG4</w:t>
+      </w:r>
+      <w:r>
+        <w:rPr>
+          <w:rFonts w:ascii="Calibri" w:cs="Calibri" w:eastAsia="Calibri" w:hAnsi="Calibri"/>
+          <w:color w:val="1E293B"/>
+          <w:sz w:val="20"/>
+          <w:szCs w:val="20"/>
+        </w:rPr>
+        <w:t xml:space="preserve"> : Chaque dossier a un numéro unique, créé automatiquement par l'application.</w:t>
       </w:r>
     </w:p>
     <w:p>
@@ -3673,7 +5702,27 @@
           <w:sz w:val="20"/>
           <w:szCs w:val="20"/>
         </w:rPr>
-        <w:t xml:space="preserve">Les moyens de paiement acceptés sont : espèces, Wave ou Mobile Money, virement.</w:t>
+        <w:t xml:space="preserve"/>
+      </w:r>
+      <w:r>
+        <w:rPr>
+          <w:rFonts w:ascii="Calibri" w:cs="Calibri" w:eastAsia="Calibri" w:hAnsi="Calibri"/>
+          <w:b/>
+          <w:bCs/>
+          <w:color w:val="1E293B"/>
+          <w:sz w:val="20"/>
+          <w:szCs w:val="20"/>
+        </w:rPr>
+        <w:t xml:space="preserve">RG5</w:t>
+      </w:r>
+      <w:r>
+        <w:rPr>
+          <w:rFonts w:ascii="Calibri" w:cs="Calibri" w:eastAsia="Calibri" w:hAnsi="Calibri"/>
+          <w:color w:val="1E293B"/>
+          <w:sz w:val="20"/>
+          <w:szCs w:val="20"/>
+        </w:rPr>
+        <w:t xml:space="preserve"> : Un dossier peut contenir plusieurs réservations (par exemple un billet et un hôtel) ; une réservation appartient à un seul dossier et a un état (en attente, confirmée, annulée). Le montant d'une réservation n'est pas un paiement.</w:t>
       </w:r>
     </w:p>
     <w:p>
@@ -3692,7 +5741,27 @@
           <w:sz w:val="20"/>
           <w:szCs w:val="20"/>
         </w:rPr>
-        <w:t xml:space="preserve">Chaque paiement donne un reçu numéroté.</w:t>
+        <w:t xml:space="preserve"/>
+      </w:r>
+      <w:r>
+        <w:rPr>
+          <w:rFonts w:ascii="Calibri" w:cs="Calibri" w:eastAsia="Calibri" w:hAnsi="Calibri"/>
+          <w:b/>
+          <w:bCs/>
+          <w:color w:val="1E293B"/>
+          <w:sz w:val="20"/>
+          <w:szCs w:val="20"/>
+        </w:rPr>
+        <w:t xml:space="preserve">RG6</w:t>
+      </w:r>
+      <w:r>
+        <w:rPr>
+          <w:rFonts w:ascii="Calibri" w:cs="Calibri" w:eastAsia="Calibri" w:hAnsi="Calibri"/>
+          <w:color w:val="1E293B"/>
+          <w:sz w:val="20"/>
+          <w:szCs w:val="20"/>
+        </w:rPr>
+        <w:t xml:space="preserve"> : Un dossier peut recevoir plusieurs paiements ; un paiement concerne un seul dossier et a une date, un montant, un moyen et un type.</w:t>
       </w:r>
     </w:p>
     <w:p>
@@ -3711,7 +5780,27 @@
           <w:sz w:val="20"/>
           <w:szCs w:val="20"/>
         </w:rPr>
-        <w:t xml:space="preserve">Un dossier est complet quand toutes les pièces demandées pour son service et son pays sont reçues.</w:t>
+        <w:t xml:space="preserve"/>
+      </w:r>
+      <w:r>
+        <w:rPr>
+          <w:rFonts w:ascii="Calibri" w:cs="Calibri" w:eastAsia="Calibri" w:hAnsi="Calibri"/>
+          <w:b/>
+          <w:bCs/>
+          <w:color w:val="1E293B"/>
+          <w:sz w:val="20"/>
+          <w:szCs w:val="20"/>
+        </w:rPr>
+        <w:t xml:space="preserve">RG7</w:t>
+      </w:r>
+      <w:r>
+        <w:rPr>
+          <w:rFonts w:ascii="Calibri" w:cs="Calibri" w:eastAsia="Calibri" w:hAnsi="Calibri"/>
+          <w:color w:val="1E293B"/>
+          <w:sz w:val="20"/>
+          <w:szCs w:val="20"/>
+        </w:rPr>
+        <w:t xml:space="preserve"> : Les moyens de paiement acceptés sont : espèces, Wave ou Mobile Money, virement. Les types de versement sont : acompte, versement ou solde.</w:t>
       </w:r>
     </w:p>
     <w:p>
@@ -3730,165 +5819,595 @@
           <w:sz w:val="20"/>
           <w:szCs w:val="20"/>
         </w:rPr>
-        <w:t xml:space="preserve">Les droits d'accès dépendent du rôle de l'utilisateur.</w:t>
-      </w:r>
-    </w:p>
-    <w:p>
-      <w:pPr>
-        <w:spacing w:after="100"/>
-      </w:pPr>
-    </w:p>
-    <w:tbl>
-      <w:tblPr>
-        <w:tblW w:type="dxa" w:w="9638"/>
-        <w:tblBorders>
-          <w:top w:val="none" w:color="FFFFFF" w:sz="0"/>
-          <w:left w:val="none" w:color="FFFFFF" w:sz="0"/>
-          <w:bottom w:val="none" w:color="FFFFFF" w:sz="0"/>
-          <w:right w:val="none" w:color="FFFFFF" w:sz="0"/>
-          <w:insideH w:val="none" w:color="FFFFFF" w:sz="0"/>
-          <w:insideV w:val="none" w:color="FFFFFF" w:sz="0"/>
-        </w:tblBorders>
-        <w:tblLayout w:type="fixed"/>
-      </w:tblPr>
-      <w:tblGrid>
-        <w:gridCol w:w="9638"/>
-      </w:tblGrid>
-      <w:tr>
-        <w:trPr>
-          <w:cantSplit/>
-        </w:trPr>
-        <w:tc>
-          <w:tcPr>
-            <w:tcW w:type="dxa" w:w="9638"/>
-            <w:tcBorders>
-              <w:top w:val="none" w:color="FFFFFF" w:sz="0"/>
-              <w:left w:val="single" w:color="F5A01A" w:sz="32"/>
-              <w:bottom w:val="none" w:color="FFFFFF" w:sz="0"/>
-              <w:right w:val="none" w:color="FFFFFF" w:sz="0"/>
-            </w:tcBorders>
-            <w:shd w:fill="FFF7E8" w:color="auto" w:val="clear"/>
-            <w:tcMar>
-              <w:top w:type="dxa" w:w="140"/>
-              <w:left w:type="dxa" w:w="240"/>
-              <w:bottom w:type="dxa" w:w="100"/>
-              <w:right w:type="dxa" w:w="160"/>
-            </w:tcMar>
-            <w:vAlign w:val="top"/>
-          </w:tcPr>
-          <w:p>
-            <w:pPr>
-              <w:spacing w:after="80"/>
-            </w:pPr>
-            <w:r>
-              <w:rPr>
-                <w:rFonts w:ascii="Calibri" w:cs="Calibri" w:eastAsia="Calibri" w:hAnsi="Calibri"/>
-                <w:color w:val="1E293B"/>
-                <w:sz w:val="20"/>
-                <w:szCs w:val="20"/>
-              </w:rPr>
-              <w:t xml:space="preserve"/>
-            </w:r>
-            <w:r>
-              <w:rPr>
-                <w:rFonts w:ascii="Calibri" w:cs="Calibri" w:eastAsia="Calibri" w:hAnsi="Calibri"/>
-                <w:b/>
-                <w:bCs/>
-                <w:color w:val="1E293B"/>
-                <w:sz w:val="20"/>
-                <w:szCs w:val="20"/>
-              </w:rPr>
-              <w:t xml:space="preserve">Règles tirées de la décharge de versement pour visa</w:t>
-            </w:r>
-            <w:r>
-              <w:rPr>
-                <w:rFonts w:ascii="Calibri" w:cs="Calibri" w:eastAsia="Calibri" w:hAnsi="Calibri"/>
-                <w:color w:val="1E293B"/>
-                <w:sz w:val="20"/>
-                <w:szCs w:val="20"/>
-              </w:rPr>
-              <w:t xml:space="preserve"/>
-            </w:r>
-          </w:p>
-          <w:p>
-            <w:pPr>
-              <w:pStyle w:val="ListParagraph"/>
-              <w:numPr>
-                <w:ilvl w:val="0"/>
-                <w:numId w:val="4"/>
-              </w:numPr>
-              <w:spacing w:after="50" w:line="270"/>
-            </w:pPr>
-            <w:r>
-              <w:rPr>
-                <w:rFonts w:ascii="Calibri" w:cs="Calibri" w:eastAsia="Calibri" w:hAnsi="Calibri"/>
-                <w:color w:val="1E293B"/>
-                <w:sz w:val="19"/>
-                <w:szCs w:val="19"/>
-              </w:rPr>
-              <w:t xml:space="preserve">Les frais d'accompagnement visa (500 000 FCFA dans le modèle fourni) sont acquis à l'agence et non remboursables.</w:t>
-            </w:r>
-          </w:p>
-          <w:p>
-            <w:pPr>
-              <w:pStyle w:val="ListParagraph"/>
-              <w:numPr>
-                <w:ilvl w:val="0"/>
-                <w:numId w:val="4"/>
-              </w:numPr>
-              <w:spacing w:after="50" w:line="270"/>
-            </w:pPr>
-            <w:r>
-              <w:rPr>
-                <w:rFonts w:ascii="Calibri" w:cs="Calibri" w:eastAsia="Calibri" w:hAnsi="Calibri"/>
-                <w:color w:val="1E293B"/>
-                <w:sz w:val="19"/>
-                <w:szCs w:val="19"/>
-              </w:rPr>
-              <w:t xml:space="preserve">Aucun remboursement n'est possible en cas d'annulation de procédure.</w:t>
-            </w:r>
-          </w:p>
-          <w:p>
-            <w:pPr>
-              <w:pStyle w:val="ListParagraph"/>
-              <w:numPr>
-                <w:ilvl w:val="0"/>
-                <w:numId w:val="4"/>
-              </w:numPr>
-              <w:spacing w:after="50" w:line="270"/>
-            </w:pPr>
-            <w:r>
-              <w:rPr>
-                <w:rFonts w:ascii="Calibri" w:cs="Calibri" w:eastAsia="Calibri" w:hAnsi="Calibri"/>
-                <w:color w:val="1E293B"/>
-                <w:sz w:val="19"/>
-                <w:szCs w:val="19"/>
-              </w:rPr>
-              <w:t xml:space="preserve">L'obtention du visa dépend uniquement des autorités consulaires, pas de l'agence.</w:t>
-            </w:r>
-          </w:p>
-          <w:p>
-            <w:pPr>
-              <w:pStyle w:val="ListParagraph"/>
-              <w:numPr>
-                <w:ilvl w:val="0"/>
-                <w:numId w:val="4"/>
-              </w:numPr>
-              <w:spacing w:after="50" w:line="270"/>
-            </w:pPr>
-            <w:r>
-              <w:rPr>
-                <w:rFonts w:ascii="Calibri" w:cs="Calibri" w:eastAsia="Calibri" w:hAnsi="Calibri"/>
-                <w:color w:val="1E293B"/>
-                <w:sz w:val="19"/>
-                <w:szCs w:val="19"/>
-              </w:rPr>
-              <w:t xml:space="preserve">Chaque décharge est établie en deux exemplaires signés, un pour chaque partie.</w:t>
-            </w:r>
-          </w:p>
-        </w:tc>
-      </w:tr>
-    </w:tbl>
+        <w:t xml:space="preserve"/>
+      </w:r>
+      <w:r>
+        <w:rPr>
+          <w:rFonts w:ascii="Calibri" w:cs="Calibri" w:eastAsia="Calibri" w:hAnsi="Calibri"/>
+          <w:b/>
+          <w:bCs/>
+          <w:color w:val="1E293B"/>
+          <w:sz w:val="20"/>
+          <w:szCs w:val="20"/>
+        </w:rPr>
+        <w:t xml:space="preserve">RG8</w:t>
+      </w:r>
+      <w:r>
+        <w:rPr>
+          <w:rFonts w:ascii="Calibri" w:cs="Calibri" w:eastAsia="Calibri" w:hAnsi="Calibri"/>
+          <w:color w:val="1E293B"/>
+          <w:sz w:val="20"/>
+          <w:szCs w:val="20"/>
+        </w:rPr>
+        <w:t xml:space="preserve"> : Le paiement se fait normalement en deux versements : 50 % à la réservation, 50 % avant le départ.</w:t>
+      </w:r>
+    </w:p>
+    <w:p>
+      <w:pPr>
+        <w:pStyle w:val="ListParagraph"/>
+        <w:numPr>
+          <w:ilvl w:val="0"/>
+          <w:numId w:val="4"/>
+        </w:numPr>
+        <w:spacing w:after="50" w:line="270"/>
+      </w:pPr>
+      <w:r>
+        <w:rPr>
+          <w:rFonts w:ascii="Calibri" w:cs="Calibri" w:eastAsia="Calibri" w:hAnsi="Calibri"/>
+          <w:color w:val="1E293B"/>
+          <w:sz w:val="20"/>
+          <w:szCs w:val="20"/>
+        </w:rPr>
+        <w:t xml:space="preserve"/>
+      </w:r>
+      <w:r>
+        <w:rPr>
+          <w:rFonts w:ascii="Calibri" w:cs="Calibri" w:eastAsia="Calibri" w:hAnsi="Calibri"/>
+          <w:b/>
+          <w:bCs/>
+          <w:color w:val="1E293B"/>
+          <w:sz w:val="20"/>
+          <w:szCs w:val="20"/>
+        </w:rPr>
+        <w:t xml:space="preserve">RG9</w:t>
+      </w:r>
+      <w:r>
+        <w:rPr>
+          <w:rFonts w:ascii="Calibri" w:cs="Calibri" w:eastAsia="Calibri" w:hAnsi="Calibri"/>
+          <w:color w:val="1E293B"/>
+          <w:sz w:val="20"/>
+          <w:szCs w:val="20"/>
+        </w:rPr>
+        <w:t xml:space="preserve"> : Un paiement peut être inhabituel : inférieur à la moitié du montant total pour l'acompte, ou plus grand que le reste à payer. L'application affiche alors un avertissement, et la personne confirme ou annule ; elle ne bloque jamais. Un surplus est affiché comme « montant payé en trop », et le reste à payer affiché est alors 0.</w:t>
+      </w:r>
+    </w:p>
+    <w:p>
+      <w:pPr>
+        <w:pStyle w:val="ListParagraph"/>
+        <w:numPr>
+          <w:ilvl w:val="0"/>
+          <w:numId w:val="4"/>
+        </w:numPr>
+        <w:spacing w:after="50" w:line="270"/>
+      </w:pPr>
+      <w:r>
+        <w:rPr>
+          <w:rFonts w:ascii="Calibri" w:cs="Calibri" w:eastAsia="Calibri" w:hAnsi="Calibri"/>
+          <w:color w:val="1E293B"/>
+          <w:sz w:val="20"/>
+          <w:szCs w:val="20"/>
+        </w:rPr>
+        <w:t xml:space="preserve"/>
+      </w:r>
+      <w:r>
+        <w:rPr>
+          <w:rFonts w:ascii="Calibri" w:cs="Calibri" w:eastAsia="Calibri" w:hAnsi="Calibri"/>
+          <w:b/>
+          <w:bCs/>
+          <w:color w:val="1E293B"/>
+          <w:sz w:val="20"/>
+          <w:szCs w:val="20"/>
+        </w:rPr>
+        <w:t xml:space="preserve">RG10</w:t>
+      </w:r>
+      <w:r>
+        <w:rPr>
+          <w:rFonts w:ascii="Calibri" w:cs="Calibri" w:eastAsia="Calibri" w:hAnsi="Calibri"/>
+          <w:color w:val="1E293B"/>
+          <w:sz w:val="20"/>
+          <w:szCs w:val="20"/>
+        </w:rPr>
+        <w:t xml:space="preserve"> : </w:t>
+      </w:r>
+      <w:r>
+        <w:rPr>
+          <w:rFonts w:ascii="Calibri" w:cs="Calibri" w:eastAsia="Calibri" w:hAnsi="Calibri"/>
+          <w:b/>
+          <w:bCs/>
+          <w:color w:val="1E293B"/>
+          <w:sz w:val="20"/>
+          <w:szCs w:val="20"/>
+        </w:rPr>
+        <w:t xml:space="preserve">Reste à payer = montant total du dossier – somme des paiements enregistrés.</w:t>
+      </w:r>
+      <w:r>
+        <w:rPr>
+          <w:rFonts w:ascii="Calibri" w:cs="Calibri" w:eastAsia="Calibri" w:hAnsi="Calibri"/>
+          <w:color w:val="1E293B"/>
+          <w:sz w:val="20"/>
+          <w:szCs w:val="20"/>
+        </w:rPr>
+        <w:t xml:space="preserve"> Il est calculé automatiquement.</w:t>
+      </w:r>
+    </w:p>
+    <w:p>
+      <w:pPr>
+        <w:pStyle w:val="ListParagraph"/>
+        <w:numPr>
+          <w:ilvl w:val="0"/>
+          <w:numId w:val="4"/>
+        </w:numPr>
+        <w:spacing w:after="50" w:line="270"/>
+      </w:pPr>
+      <w:r>
+        <w:rPr>
+          <w:rFonts w:ascii="Calibri" w:cs="Calibri" w:eastAsia="Calibri" w:hAnsi="Calibri"/>
+          <w:color w:val="1E293B"/>
+          <w:sz w:val="20"/>
+          <w:szCs w:val="20"/>
+        </w:rPr>
+        <w:t xml:space="preserve"/>
+      </w:r>
+      <w:r>
+        <w:rPr>
+          <w:rFonts w:ascii="Calibri" w:cs="Calibri" w:eastAsia="Calibri" w:hAnsi="Calibri"/>
+          <w:b/>
+          <w:bCs/>
+          <w:color w:val="1E293B"/>
+          <w:sz w:val="20"/>
+          <w:szCs w:val="20"/>
+        </w:rPr>
+        <w:t xml:space="preserve">RG11</w:t>
+      </w:r>
+      <w:r>
+        <w:rPr>
+          <w:rFonts w:ascii="Calibri" w:cs="Calibri" w:eastAsia="Calibri" w:hAnsi="Calibri"/>
+          <w:color w:val="1E293B"/>
+          <w:sz w:val="20"/>
+          <w:szCs w:val="20"/>
+        </w:rPr>
+        <w:t xml:space="preserve"> : Chaque paiement est enregistré par un seul utilisateur et donne un reçu au numéro unique, qui indique la personne qui l'a enregistré, la date et l'heure ; le reçu est imprimé en deux exemplaires.</w:t>
+      </w:r>
+    </w:p>
+    <w:p>
+      <w:pPr>
+        <w:pStyle w:val="ListParagraph"/>
+        <w:numPr>
+          <w:ilvl w:val="0"/>
+          <w:numId w:val="4"/>
+        </w:numPr>
+        <w:spacing w:after="50" w:line="270"/>
+      </w:pPr>
+      <w:r>
+        <w:rPr>
+          <w:rFonts w:ascii="Calibri" w:cs="Calibri" w:eastAsia="Calibri" w:hAnsi="Calibri"/>
+          <w:color w:val="1E293B"/>
+          <w:sz w:val="20"/>
+          <w:szCs w:val="20"/>
+        </w:rPr>
+        <w:t xml:space="preserve"/>
+      </w:r>
+      <w:r>
+        <w:rPr>
+          <w:rFonts w:ascii="Calibri" w:cs="Calibri" w:eastAsia="Calibri" w:hAnsi="Calibri"/>
+          <w:b/>
+          <w:bCs/>
+          <w:color w:val="1E293B"/>
+          <w:sz w:val="20"/>
+          <w:szCs w:val="20"/>
+        </w:rPr>
+        <w:t xml:space="preserve">RG12</w:t>
+      </w:r>
+      <w:r>
+        <w:rPr>
+          <w:rFonts w:ascii="Calibri" w:cs="Calibri" w:eastAsia="Calibri" w:hAnsi="Calibri"/>
+          <w:color w:val="1E293B"/>
+          <w:sz w:val="20"/>
+          <w:szCs w:val="20"/>
+        </w:rPr>
+        <w:t xml:space="preserve"> : L'agent enregistre seulement des acomptes ; la comptable et la directrice enregistrent tous les types de paiement.</w:t>
+      </w:r>
+    </w:p>
+    <w:p>
+      <w:pPr>
+        <w:pStyle w:val="ListParagraph"/>
+        <w:numPr>
+          <w:ilvl w:val="0"/>
+          <w:numId w:val="4"/>
+        </w:numPr>
+        <w:spacing w:after="50" w:line="270"/>
+      </w:pPr>
+      <w:r>
+        <w:rPr>
+          <w:rFonts w:ascii="Calibri" w:cs="Calibri" w:eastAsia="Calibri" w:hAnsi="Calibri"/>
+          <w:color w:val="1E293B"/>
+          <w:sz w:val="20"/>
+          <w:szCs w:val="20"/>
+        </w:rPr>
+        <w:t xml:space="preserve"/>
+      </w:r>
+      <w:r>
+        <w:rPr>
+          <w:rFonts w:ascii="Calibri" w:cs="Calibri" w:eastAsia="Calibri" w:hAnsi="Calibri"/>
+          <w:b/>
+          <w:bCs/>
+          <w:color w:val="1E293B"/>
+          <w:sz w:val="20"/>
+          <w:szCs w:val="20"/>
+        </w:rPr>
+        <w:t xml:space="preserve">RG13</w:t>
+      </w:r>
+      <w:r>
+        <w:rPr>
+          <w:rFonts w:ascii="Calibri" w:cs="Calibri" w:eastAsia="Calibri" w:hAnsi="Calibri"/>
+          <w:color w:val="1E293B"/>
+          <w:sz w:val="20"/>
+          <w:szCs w:val="20"/>
+        </w:rPr>
+        <w:t xml:space="preserve"> : Un paiement en espèces pour un visa donne au plus une décharge de versement ; une décharge correspond à un seul paiement. Elle est établie en deux exemplaires signés, un pour chaque partie, et gardée dans le dossier du client.</w:t>
+      </w:r>
+    </w:p>
+    <w:p>
+      <w:pPr>
+        <w:pStyle w:val="ListParagraph"/>
+        <w:numPr>
+          <w:ilvl w:val="0"/>
+          <w:numId w:val="4"/>
+        </w:numPr>
+        <w:spacing w:after="50" w:line="270"/>
+      </w:pPr>
+      <w:r>
+        <w:rPr>
+          <w:rFonts w:ascii="Calibri" w:cs="Calibri" w:eastAsia="Calibri" w:hAnsi="Calibri"/>
+          <w:color w:val="1E293B"/>
+          <w:sz w:val="20"/>
+          <w:szCs w:val="20"/>
+        </w:rPr>
+        <w:t xml:space="preserve"/>
+      </w:r>
+      <w:r>
+        <w:rPr>
+          <w:rFonts w:ascii="Calibri" w:cs="Calibri" w:eastAsia="Calibri" w:hAnsi="Calibri"/>
+          <w:b/>
+          <w:bCs/>
+          <w:color w:val="1E293B"/>
+          <w:sz w:val="20"/>
+          <w:szCs w:val="20"/>
+        </w:rPr>
+        <w:t xml:space="preserve">RG14</w:t>
+      </w:r>
+      <w:r>
+        <w:rPr>
+          <w:rFonts w:ascii="Calibri" w:cs="Calibri" w:eastAsia="Calibri" w:hAnsi="Calibri"/>
+          <w:color w:val="1E293B"/>
+          <w:sz w:val="20"/>
+          <w:szCs w:val="20"/>
+        </w:rPr>
+        <w:t xml:space="preserve"> : Les frais d'accompagnement visa (500 000 FCFA dans le modèle fourni) sont acquis à l'agence et non remboursables ; aucun remboursement n'est possible en cas d'annulation de procédure.</w:t>
+      </w:r>
+    </w:p>
+    <w:p>
+      <w:pPr>
+        <w:pStyle w:val="ListParagraph"/>
+        <w:numPr>
+          <w:ilvl w:val="0"/>
+          <w:numId w:val="4"/>
+        </w:numPr>
+        <w:spacing w:after="50" w:line="270"/>
+      </w:pPr>
+      <w:r>
+        <w:rPr>
+          <w:rFonts w:ascii="Calibri" w:cs="Calibri" w:eastAsia="Calibri" w:hAnsi="Calibri"/>
+          <w:color w:val="1E293B"/>
+          <w:sz w:val="20"/>
+          <w:szCs w:val="20"/>
+        </w:rPr>
+        <w:t xml:space="preserve"/>
+      </w:r>
+      <w:r>
+        <w:rPr>
+          <w:rFonts w:ascii="Calibri" w:cs="Calibri" w:eastAsia="Calibri" w:hAnsi="Calibri"/>
+          <w:b/>
+          <w:bCs/>
+          <w:color w:val="1E293B"/>
+          <w:sz w:val="20"/>
+          <w:szCs w:val="20"/>
+        </w:rPr>
+        <w:t xml:space="preserve">RG15</w:t>
+      </w:r>
+      <w:r>
+        <w:rPr>
+          <w:rFonts w:ascii="Calibri" w:cs="Calibri" w:eastAsia="Calibri" w:hAnsi="Calibri"/>
+          <w:color w:val="1E293B"/>
+          <w:sz w:val="20"/>
+          <w:szCs w:val="20"/>
+        </w:rPr>
+        <w:t xml:space="preserve"> : L'obtention du visa dépend uniquement des autorités consulaires, pas de l'agence.</w:t>
+      </w:r>
+    </w:p>
+    <w:p>
+      <w:pPr>
+        <w:pStyle w:val="ListParagraph"/>
+        <w:numPr>
+          <w:ilvl w:val="0"/>
+          <w:numId w:val="4"/>
+        </w:numPr>
+        <w:spacing w:after="50" w:line="270"/>
+      </w:pPr>
+      <w:r>
+        <w:rPr>
+          <w:rFonts w:ascii="Calibri" w:cs="Calibri" w:eastAsia="Calibri" w:hAnsi="Calibri"/>
+          <w:color w:val="1E293B"/>
+          <w:sz w:val="20"/>
+          <w:szCs w:val="20"/>
+        </w:rPr>
+        <w:t xml:space="preserve"/>
+      </w:r>
+      <w:r>
+        <w:rPr>
+          <w:rFonts w:ascii="Calibri" w:cs="Calibri" w:eastAsia="Calibri" w:hAnsi="Calibri"/>
+          <w:b/>
+          <w:bCs/>
+          <w:color w:val="1E293B"/>
+          <w:sz w:val="20"/>
+          <w:szCs w:val="20"/>
+        </w:rPr>
+        <w:t xml:space="preserve">RG16</w:t>
+      </w:r>
+      <w:r>
+        <w:rPr>
+          <w:rFonts w:ascii="Calibri" w:cs="Calibri" w:eastAsia="Calibri" w:hAnsi="Calibri"/>
+          <w:color w:val="1E293B"/>
+          <w:sz w:val="20"/>
+          <w:szCs w:val="20"/>
+        </w:rPr>
+        <w:t xml:space="preserve"> : La liste des pièces à fournir dépend du service et du pays de destination ; chaque pièce d'un dossier est soit reçue, soit manquante.</w:t>
+      </w:r>
+    </w:p>
+    <w:p>
+      <w:pPr>
+        <w:pStyle w:val="ListParagraph"/>
+        <w:numPr>
+          <w:ilvl w:val="0"/>
+          <w:numId w:val="4"/>
+        </w:numPr>
+        <w:spacing w:after="50" w:line="270"/>
+      </w:pPr>
+      <w:r>
+        <w:rPr>
+          <w:rFonts w:ascii="Calibri" w:cs="Calibri" w:eastAsia="Calibri" w:hAnsi="Calibri"/>
+          <w:color w:val="1E293B"/>
+          <w:sz w:val="20"/>
+          <w:szCs w:val="20"/>
+        </w:rPr>
+        <w:t xml:space="preserve"/>
+      </w:r>
+      <w:r>
+        <w:rPr>
+          <w:rFonts w:ascii="Calibri" w:cs="Calibri" w:eastAsia="Calibri" w:hAnsi="Calibri"/>
+          <w:b/>
+          <w:bCs/>
+          <w:color w:val="1E293B"/>
+          <w:sz w:val="20"/>
+          <w:szCs w:val="20"/>
+        </w:rPr>
+        <w:t xml:space="preserve">RG17</w:t>
+      </w:r>
+      <w:r>
+        <w:rPr>
+          <w:rFonts w:ascii="Calibri" w:cs="Calibri" w:eastAsia="Calibri" w:hAnsi="Calibri"/>
+          <w:color w:val="1E293B"/>
+          <w:sz w:val="20"/>
+          <w:szCs w:val="20"/>
+        </w:rPr>
+        <w:t xml:space="preserve"> : Un dossier est complet quand toutes les pièces demandées pour son service et son pays sont reçues.</w:t>
+      </w:r>
+    </w:p>
+    <w:p>
+      <w:pPr>
+        <w:pStyle w:val="ListParagraph"/>
+        <w:numPr>
+          <w:ilvl w:val="0"/>
+          <w:numId w:val="4"/>
+        </w:numPr>
+        <w:spacing w:after="50" w:line="270"/>
+      </w:pPr>
+      <w:r>
+        <w:rPr>
+          <w:rFonts w:ascii="Calibri" w:cs="Calibri" w:eastAsia="Calibri" w:hAnsi="Calibri"/>
+          <w:color w:val="1E293B"/>
+          <w:sz w:val="20"/>
+          <w:szCs w:val="20"/>
+        </w:rPr>
+        <w:t xml:space="preserve"/>
+      </w:r>
+      <w:r>
+        <w:rPr>
+          <w:rFonts w:ascii="Calibri" w:cs="Calibri" w:eastAsia="Calibri" w:hAnsi="Calibri"/>
+          <w:b/>
+          <w:bCs/>
+          <w:color w:val="1E293B"/>
+          <w:sz w:val="20"/>
+          <w:szCs w:val="20"/>
+        </w:rPr>
+        <w:t xml:space="preserve">RG18</w:t>
+      </w:r>
+      <w:r>
+        <w:rPr>
+          <w:rFonts w:ascii="Calibri" w:cs="Calibri" w:eastAsia="Calibri" w:hAnsi="Calibri"/>
+          <w:color w:val="1E293B"/>
+          <w:sz w:val="20"/>
+          <w:szCs w:val="20"/>
+        </w:rPr>
+        <w:t xml:space="preserve"> : Un dossier peut avoir plusieurs dates importantes (limite de paiement, dépôt de visa, départ, relance) ; une date concerne un seul dossier, et l'application alerte quand elle approche.</w:t>
+      </w:r>
+    </w:p>
+    <w:p>
+      <w:pPr>
+        <w:pStyle w:val="ListParagraph"/>
+        <w:numPr>
+          <w:ilvl w:val="0"/>
+          <w:numId w:val="4"/>
+        </w:numPr>
+        <w:spacing w:after="50" w:line="270"/>
+      </w:pPr>
+      <w:r>
+        <w:rPr>
+          <w:rFonts w:ascii="Calibri" w:cs="Calibri" w:eastAsia="Calibri" w:hAnsi="Calibri"/>
+          <w:color w:val="1E293B"/>
+          <w:sz w:val="20"/>
+          <w:szCs w:val="20"/>
+        </w:rPr>
+        <w:t xml:space="preserve"/>
+      </w:r>
+      <w:r>
+        <w:rPr>
+          <w:rFonts w:ascii="Calibri" w:cs="Calibri" w:eastAsia="Calibri" w:hAnsi="Calibri"/>
+          <w:b/>
+          <w:bCs/>
+          <w:color w:val="1E293B"/>
+          <w:sz w:val="20"/>
+          <w:szCs w:val="20"/>
+        </w:rPr>
+        <w:t xml:space="preserve">RG19</w:t>
+      </w:r>
+      <w:r>
+        <w:rPr>
+          <w:rFonts w:ascii="Calibri" w:cs="Calibri" w:eastAsia="Calibri" w:hAnsi="Calibri"/>
+          <w:color w:val="1E293B"/>
+          <w:sz w:val="20"/>
+          <w:szCs w:val="20"/>
+        </w:rPr>
+        <w:t xml:space="preserve"> : Chaque action importante sur un dossier est enregistrée dans son historique, avec l'utilisateur qui l'a faite, la date et l'heure.</w:t>
+      </w:r>
+    </w:p>
+    <w:p>
+      <w:pPr>
+        <w:pStyle w:val="ListParagraph"/>
+        <w:numPr>
+          <w:ilvl w:val="0"/>
+          <w:numId w:val="4"/>
+        </w:numPr>
+        <w:spacing w:after="50" w:line="270"/>
+      </w:pPr>
+      <w:r>
+        <w:rPr>
+          <w:rFonts w:ascii="Calibri" w:cs="Calibri" w:eastAsia="Calibri" w:hAnsi="Calibri"/>
+          <w:color w:val="1E293B"/>
+          <w:sz w:val="20"/>
+          <w:szCs w:val="20"/>
+        </w:rPr>
+        <w:t xml:space="preserve"/>
+      </w:r>
+      <w:r>
+        <w:rPr>
+          <w:rFonts w:ascii="Calibri" w:cs="Calibri" w:eastAsia="Calibri" w:hAnsi="Calibri"/>
+          <w:b/>
+          <w:bCs/>
+          <w:color w:val="1E293B"/>
+          <w:sz w:val="20"/>
+          <w:szCs w:val="20"/>
+        </w:rPr>
+        <w:t xml:space="preserve">RG20</w:t>
+      </w:r>
+      <w:r>
+        <w:rPr>
+          <w:rFonts w:ascii="Calibri" w:cs="Calibri" w:eastAsia="Calibri" w:hAnsi="Calibri"/>
+          <w:color w:val="1E293B"/>
+          <w:sz w:val="20"/>
+          <w:szCs w:val="20"/>
+        </w:rPr>
+        <w:t xml:space="preserve"> : Chaque utilisateur a un identifiant unique, un mot de passe, un seul rôle (directrice, agent ou comptable) et un état (actif ou inactif) ; un compte inactif ne peut plus se connecter.</w:t>
+      </w:r>
+    </w:p>
+    <w:p>
+      <w:pPr>
+        <w:pStyle w:val="ListParagraph"/>
+        <w:numPr>
+          <w:ilvl w:val="0"/>
+          <w:numId w:val="4"/>
+        </w:numPr>
+        <w:spacing w:after="50" w:line="270"/>
+      </w:pPr>
+      <w:r>
+        <w:rPr>
+          <w:rFonts w:ascii="Calibri" w:cs="Calibri" w:eastAsia="Calibri" w:hAnsi="Calibri"/>
+          <w:color w:val="1E293B"/>
+          <w:sz w:val="20"/>
+          <w:szCs w:val="20"/>
+        </w:rPr>
+        <w:t xml:space="preserve"/>
+      </w:r>
+      <w:r>
+        <w:rPr>
+          <w:rFonts w:ascii="Calibri" w:cs="Calibri" w:eastAsia="Calibri" w:hAnsi="Calibri"/>
+          <w:b/>
+          <w:bCs/>
+          <w:color w:val="1E293B"/>
+          <w:sz w:val="20"/>
+          <w:szCs w:val="20"/>
+        </w:rPr>
+        <w:t xml:space="preserve">RG21</w:t>
+      </w:r>
+      <w:r>
+        <w:rPr>
+          <w:rFonts w:ascii="Calibri" w:cs="Calibri" w:eastAsia="Calibri" w:hAnsi="Calibri"/>
+          <w:color w:val="1E293B"/>
+          <w:sz w:val="20"/>
+          <w:szCs w:val="20"/>
+        </w:rPr>
+        <w:t xml:space="preserve"> : Seule la directrice crée les comptes ; les clients n'ont pas de compte et il n'y a pas d'inscription publique.</w:t>
+      </w:r>
+    </w:p>
+    <w:p>
+      <w:pPr>
+        <w:pStyle w:val="ListParagraph"/>
+        <w:numPr>
+          <w:ilvl w:val="0"/>
+          <w:numId w:val="4"/>
+        </w:numPr>
+        <w:spacing w:after="50" w:line="270"/>
+      </w:pPr>
+      <w:r>
+        <w:rPr>
+          <w:rFonts w:ascii="Calibri" w:cs="Calibri" w:eastAsia="Calibri" w:hAnsi="Calibri"/>
+          <w:color w:val="1E293B"/>
+          <w:sz w:val="20"/>
+          <w:szCs w:val="20"/>
+        </w:rPr>
+        <w:t xml:space="preserve"/>
+      </w:r>
+      <w:r>
+        <w:rPr>
+          <w:rFonts w:ascii="Calibri" w:cs="Calibri" w:eastAsia="Calibri" w:hAnsi="Calibri"/>
+          <w:b/>
+          <w:bCs/>
+          <w:color w:val="1E293B"/>
+          <w:sz w:val="20"/>
+          <w:szCs w:val="20"/>
+        </w:rPr>
+        <w:t xml:space="preserve">RG22</w:t>
+      </w:r>
+      <w:r>
+        <w:rPr>
+          <w:rFonts w:ascii="Calibri" w:cs="Calibri" w:eastAsia="Calibri" w:hAnsi="Calibri"/>
+          <w:color w:val="1E293B"/>
+          <w:sz w:val="20"/>
+          <w:szCs w:val="20"/>
+        </w:rPr>
+        <w:t xml:space="preserve"> : Les droits d'accès et le menu dépendent du rôle : seule la directrice voit les statistiques, et la comptable n'a pas accès aux pièces et échéances.</w:t>
+      </w:r>
+    </w:p>
     <w:p>
       <w:pPr>
         <w:pStyle w:val="Heading1"/>
@@ -3908,7 +6427,7 @@
           <w:szCs w:val="30"/>
           <w:shd w:fill="F5A01A" w:color="auto" w:val="clear"/>
         </w:rPr>
-        <w:t xml:space="preserve"> 7 </w:t>
+        <w:t xml:space="preserve"> 8 </w:t>
       </w:r>
       <w:r>
         <w:rPr>
@@ -4051,7 +6570,7 @@
                 <w:sz w:val="19"/>
                 <w:szCs w:val="19"/>
               </w:rPr>
-              <w:t xml:space="preserve">Lisible aussi bien sur ordinateur que sur petit écran de téléphone.</w:t>
+              <w:t xml:space="preserve">Lisible aussi bien sur ordinateur que sur petit écran de téléphone, avec une version téléphone pour l'accueil, la fiche dossier et l'enregistrement d'un paiement.</w:t>
             </w:r>
           </w:p>
         </w:tc>
@@ -4257,7 +6776,7 @@
                 <w:sz w:val="19"/>
                 <w:szCs w:val="19"/>
               </w:rPr>
-              <w:t xml:space="preserve">Reçus imprimables sur l'imprimante de l'agence.</w:t>
+              <w:t xml:space="preserve">Reçus et décharges imprimables en deux exemplaires sur l'imprimante de l'agence.</w:t>
             </w:r>
           </w:p>
         </w:tc>
@@ -4311,7 +6830,7 @@
                 <w:sz w:val="19"/>
                 <w:szCs w:val="19"/>
               </w:rPr>
-              <w:t xml:space="preserve">L'agence dispose d'une connexion ; le comportement en cas de coupure reste à préciser avec elle.</w:t>
+              <w:t xml:space="preserve">L'application demande une connexion internet. En cas de coupure, l'agence continue sur papier (carnet à souche) et ressaisit ensuite les informations. Un mode sans connexion n'est pas prévu dans cette version.</w:t>
             </w:r>
           </w:p>
         </w:tc>
@@ -4385,7 +6904,7 @@
           <w:szCs w:val="30"/>
           <w:shd w:fill="1D4ED8" w:color="auto" w:val="clear"/>
         </w:rPr>
-        <w:t xml:space="preserve"> 8 </w:t>
+        <w:t xml:space="preserve"> 9 </w:t>
       </w:r>
       <w:r>
         <w:rPr>
@@ -5529,7 +8048,7 @@
           <w:szCs w:val="30"/>
           <w:shd w:fill="F5A01A" w:color="auto" w:val="clear"/>
         </w:rPr>
-        <w:t xml:space="preserve"> 9 </w:t>
+        <w:t xml:space="preserve"> 10 </w:t>
       </w:r>
       <w:r>
         <w:rPr>
@@ -5900,7 +8419,7 @@
           <w:szCs w:val="30"/>
           <w:shd w:fill="0F766E" w:color="auto" w:val="clear"/>
         </w:rPr>
-        <w:t xml:space="preserve"> 10 </w:t>
+        <w:t xml:space="preserve"> 11 </w:t>
       </w:r>
       <w:r>
         <w:rPr>
@@ -6770,45 +9289,7 @@
                 <w:sz w:val="19"/>
                 <w:szCs w:val="19"/>
               </w:rPr>
-              <w:t xml:space="preserve">Les droits d'accès de chaque rôle (directrice, agents, comptable).</w:t>
-            </w:r>
-          </w:p>
-          <w:p>
-            <w:pPr>
-              <w:pStyle w:val="ListParagraph"/>
-              <w:numPr>
-                <w:ilvl w:val="0"/>
-                <w:numId w:val="4"/>
-              </w:numPr>
-              <w:spacing w:after="50" w:line="270"/>
-            </w:pPr>
-            <w:r>
-              <w:rPr>
-                <w:rFonts w:ascii="Calibri" w:cs="Calibri" w:eastAsia="Calibri" w:hAnsi="Calibri"/>
-                <w:color w:val="1E293B"/>
-                <w:sz w:val="19"/>
-                <w:szCs w:val="19"/>
-              </w:rPr>
               <w:t xml:space="preserve">Le montant des frais d'accompagnement visa : 500 000 FCFA fixes, ou variables selon le pays et le visa ?</w:t>
-            </w:r>
-          </w:p>
-          <w:p>
-            <w:pPr>
-              <w:pStyle w:val="ListParagraph"/>
-              <w:numPr>
-                <w:ilvl w:val="0"/>
-                <w:numId w:val="4"/>
-              </w:numPr>
-              <w:spacing w:after="50" w:line="270"/>
-            </w:pPr>
-            <w:r>
-              <w:rPr>
-                <w:rFonts w:ascii="Calibri" w:cs="Calibri" w:eastAsia="Calibri" w:hAnsi="Calibri"/>
-                <w:color w:val="1E293B"/>
-                <w:sz w:val="19"/>
-                <w:szCs w:val="19"/>
-              </w:rPr>
-              <w:t xml:space="preserve">Le comportement attendu quand la connexion internet est coupée.</w:t>
             </w:r>
           </w:p>
         </w:tc>

</xml_diff>